<commit_message>
MCP Registry Architecture v1.1
MCP Registry Architecture v1.1

Added Section 2.3 — What This Proposal Does Not Solve.

Clarifies that _mcp DNS record is a discovery primitive only.
Authentication, authorisation, and tool capability enumeration
are explicitly out of scope for the DNS layer.

Prompted by peer review from network security practitioner.
Addresses likely community question ahead of public discussion.
</commit_message>
<xml_diff>
--- a/paper/mcp-registry-architecture.docx
+++ b/paper/mcp-registry-architecture.docx
@@ -201,7 +201,14 @@
           <w:rFonts w:ascii="Source Serif 4 ExtraLight" w:hAnsi="Source Serif 4 ExtraLight"/>
           <w:szCs w:val="22"/>
         </w:rPr>
-        <w:t>Version 1.0</w:t>
+        <w:t>Version 1.</w:t>
+      </w:r>
+      <w:r>
+        <w:rPr>
+          <w:rFonts w:ascii="Source Serif 4 ExtraLight" w:hAnsi="Source Serif 4 ExtraLight"/>
+          <w:szCs w:val="22"/>
+        </w:rPr>
+        <w:t>1</w:t>
       </w:r>
     </w:p>
     <w:p>
@@ -217,7 +224,21 @@
           <w:rFonts w:ascii="Source Serif 4 ExtraLight" w:hAnsi="Source Serif 4 ExtraLight"/>
           <w:szCs w:val="22"/>
         </w:rPr>
-        <w:t>25 February 2026</w:t>
+        <w:t>2</w:t>
+      </w:r>
+      <w:r>
+        <w:rPr>
+          <w:rFonts w:ascii="Source Serif 4 ExtraLight" w:hAnsi="Source Serif 4 ExtraLight"/>
+          <w:szCs w:val="22"/>
+        </w:rPr>
+        <w:t>7</w:t>
+      </w:r>
+      <w:r>
+        <w:rPr>
+          <w:rFonts w:ascii="Source Serif 4 ExtraLight" w:hAnsi="Source Serif 4 ExtraLight"/>
+          <w:szCs w:val="22"/>
+        </w:rPr>
+        <w:t xml:space="preserve"> February 2026</w:t>
       </w:r>
     </w:p>
     <w:p>
@@ -312,6 +333,349 @@
       </w:r>
     </w:p>
     <w:p>
+      <w:pPr>
+        <w:spacing w:after="0" w:line="240" w:lineRule="auto"/>
+      </w:pPr>
+      <w:r>
+        <w:br w:type="page"/>
+      </w:r>
+    </w:p>
+    <w:p>
+      <w:pPr>
+        <w:pStyle w:val="Heading2"/>
+      </w:pPr>
+      <w:r>
+        <w:lastRenderedPageBreak/>
+        <w:t>Document History</w:t>
+      </w:r>
+    </w:p>
+    <w:tbl>
+      <w:tblPr>
+        <w:tblStyle w:val="PlainTable1"/>
+        <w:tblW w:w="0" w:type="auto"/>
+        <w:tblLook w:val="04A0" w:firstRow="1" w:lastRow="0" w:firstColumn="1" w:lastColumn="0" w:noHBand="0" w:noVBand="1"/>
+      </w:tblPr>
+      <w:tblGrid>
+        <w:gridCol w:w="882"/>
+        <w:gridCol w:w="1807"/>
+        <w:gridCol w:w="1134"/>
+        <w:gridCol w:w="5188"/>
+      </w:tblGrid>
+      <w:tr>
+        <w:trPr>
+          <w:cnfStyle w:val="100000000000" w:firstRow="1" w:lastRow="0" w:firstColumn="0" w:lastColumn="0" w:oddVBand="0" w:evenVBand="0" w:oddHBand="0" w:evenHBand="0" w:firstRowFirstColumn="0" w:firstRowLastColumn="0" w:lastRowFirstColumn="0" w:lastRowLastColumn="0"/>
+        </w:trPr>
+        <w:tc>
+          <w:tcPr>
+            <w:cnfStyle w:val="001000000000" w:firstRow="0" w:lastRow="0" w:firstColumn="1" w:lastColumn="0" w:oddVBand="0" w:evenVBand="0" w:oddHBand="0" w:evenHBand="0" w:firstRowFirstColumn="0" w:firstRowLastColumn="0" w:lastRowFirstColumn="0" w:lastRowLastColumn="0"/>
+            <w:tcW w:w="882" w:type="dxa"/>
+            <w:shd w:val="clear" w:color="auto" w:fill="D4E4FC"/>
+          </w:tcPr>
+          <w:p>
+            <w:pPr>
+              <w:pStyle w:val="NoSpacing"/>
+              <w:rPr>
+                <w:sz w:val="18"/>
+                <w:szCs w:val="18"/>
+              </w:rPr>
+            </w:pPr>
+            <w:r>
+              <w:rPr>
+                <w:sz w:val="18"/>
+                <w:szCs w:val="18"/>
+              </w:rPr>
+              <w:t>Version</w:t>
+            </w:r>
+          </w:p>
+        </w:tc>
+        <w:tc>
+          <w:tcPr>
+            <w:tcW w:w="1807" w:type="dxa"/>
+            <w:shd w:val="clear" w:color="auto" w:fill="D4E4FC"/>
+          </w:tcPr>
+          <w:p>
+            <w:pPr>
+              <w:pStyle w:val="NoSpacing"/>
+              <w:cnfStyle w:val="100000000000" w:firstRow="1" w:lastRow="0" w:firstColumn="0" w:lastColumn="0" w:oddVBand="0" w:evenVBand="0" w:oddHBand="0" w:evenHBand="0" w:firstRowFirstColumn="0" w:firstRowLastColumn="0" w:lastRowFirstColumn="0" w:lastRowLastColumn="0"/>
+              <w:rPr>
+                <w:sz w:val="18"/>
+                <w:szCs w:val="18"/>
+              </w:rPr>
+            </w:pPr>
+            <w:r>
+              <w:rPr>
+                <w:sz w:val="18"/>
+                <w:szCs w:val="18"/>
+              </w:rPr>
+              <w:t>Date</w:t>
+            </w:r>
+          </w:p>
+        </w:tc>
+        <w:tc>
+          <w:tcPr>
+            <w:tcW w:w="1134" w:type="dxa"/>
+            <w:shd w:val="clear" w:color="auto" w:fill="D4E4FC"/>
+          </w:tcPr>
+          <w:p>
+            <w:pPr>
+              <w:pStyle w:val="NoSpacing"/>
+              <w:cnfStyle w:val="100000000000" w:firstRow="1" w:lastRow="0" w:firstColumn="0" w:lastColumn="0" w:oddVBand="0" w:evenVBand="0" w:oddHBand="0" w:evenHBand="0" w:firstRowFirstColumn="0" w:firstRowLastColumn="0" w:lastRowFirstColumn="0" w:lastRowLastColumn="0"/>
+              <w:rPr>
+                <w:sz w:val="18"/>
+                <w:szCs w:val="18"/>
+              </w:rPr>
+            </w:pPr>
+            <w:r>
+              <w:rPr>
+                <w:sz w:val="18"/>
+                <w:szCs w:val="18"/>
+              </w:rPr>
+              <w:t>Status</w:t>
+            </w:r>
+          </w:p>
+        </w:tc>
+        <w:tc>
+          <w:tcPr>
+            <w:tcW w:w="5188" w:type="dxa"/>
+            <w:shd w:val="clear" w:color="auto" w:fill="D4E4FC"/>
+          </w:tcPr>
+          <w:p>
+            <w:pPr>
+              <w:pStyle w:val="NoSpacing"/>
+              <w:cnfStyle w:val="100000000000" w:firstRow="1" w:lastRow="0" w:firstColumn="0" w:lastColumn="0" w:oddVBand="0" w:evenVBand="0" w:oddHBand="0" w:evenHBand="0" w:firstRowFirstColumn="0" w:firstRowLastColumn="0" w:lastRowFirstColumn="0" w:lastRowLastColumn="0"/>
+              <w:rPr>
+                <w:sz w:val="18"/>
+                <w:szCs w:val="18"/>
+              </w:rPr>
+            </w:pPr>
+            <w:r>
+              <w:rPr>
+                <w:sz w:val="18"/>
+                <w:szCs w:val="18"/>
+              </w:rPr>
+              <w:t>Summary of Change</w:t>
+            </w:r>
+          </w:p>
+        </w:tc>
+      </w:tr>
+      <w:tr>
+        <w:trPr>
+          <w:cnfStyle w:val="000000100000" w:firstRow="0" w:lastRow="0" w:firstColumn="0" w:lastColumn="0" w:oddVBand="0" w:evenVBand="0" w:oddHBand="1" w:evenHBand="0" w:firstRowFirstColumn="0" w:firstRowLastColumn="0" w:lastRowFirstColumn="0" w:lastRowLastColumn="0"/>
+        </w:trPr>
+        <w:tc>
+          <w:tcPr>
+            <w:cnfStyle w:val="001000000000" w:firstRow="0" w:lastRow="0" w:firstColumn="1" w:lastColumn="0" w:oddVBand="0" w:evenVBand="0" w:oddHBand="0" w:evenHBand="0" w:firstRowFirstColumn="0" w:firstRowLastColumn="0" w:lastRowFirstColumn="0" w:lastRowLastColumn="0"/>
+            <w:tcW w:w="882" w:type="dxa"/>
+          </w:tcPr>
+          <w:p>
+            <w:pPr>
+              <w:pStyle w:val="NoSpacing"/>
+              <w:rPr>
+                <w:b w:val="0"/>
+                <w:bCs w:val="0"/>
+                <w:sz w:val="18"/>
+                <w:szCs w:val="18"/>
+              </w:rPr>
+            </w:pPr>
+            <w:r>
+              <w:rPr>
+                <w:b w:val="0"/>
+                <w:bCs w:val="0"/>
+                <w:sz w:val="18"/>
+                <w:szCs w:val="18"/>
+              </w:rPr>
+              <w:t>1.0</w:t>
+            </w:r>
+          </w:p>
+        </w:tc>
+        <w:tc>
+          <w:tcPr>
+            <w:tcW w:w="1807" w:type="dxa"/>
+          </w:tcPr>
+          <w:p>
+            <w:pPr>
+              <w:pStyle w:val="NoSpacing"/>
+              <w:cnfStyle w:val="000000100000" w:firstRow="0" w:lastRow="0" w:firstColumn="0" w:lastColumn="0" w:oddVBand="0" w:evenVBand="0" w:oddHBand="1" w:evenHBand="0" w:firstRowFirstColumn="0" w:firstRowLastColumn="0" w:lastRowFirstColumn="0" w:lastRowLastColumn="0"/>
+              <w:rPr>
+                <w:sz w:val="18"/>
+                <w:szCs w:val="18"/>
+              </w:rPr>
+            </w:pPr>
+            <w:r>
+              <w:rPr>
+                <w:sz w:val="18"/>
+                <w:szCs w:val="18"/>
+              </w:rPr>
+              <w:t>25 February 2026</w:t>
+            </w:r>
+          </w:p>
+        </w:tc>
+        <w:tc>
+          <w:tcPr>
+            <w:tcW w:w="1134" w:type="dxa"/>
+          </w:tcPr>
+          <w:p>
+            <w:pPr>
+              <w:pStyle w:val="NoSpacing"/>
+              <w:cnfStyle w:val="000000100000" w:firstRow="0" w:lastRow="0" w:firstColumn="0" w:lastColumn="0" w:oddVBand="0" w:evenVBand="0" w:oddHBand="1" w:evenHBand="0" w:firstRowFirstColumn="0" w:firstRowLastColumn="0" w:lastRowFirstColumn="0" w:lastRowLastColumn="0"/>
+              <w:rPr>
+                <w:sz w:val="18"/>
+                <w:szCs w:val="18"/>
+              </w:rPr>
+            </w:pPr>
+            <w:r>
+              <w:rPr>
+                <w:sz w:val="18"/>
+                <w:szCs w:val="18"/>
+              </w:rPr>
+              <w:t>Published</w:t>
+            </w:r>
+          </w:p>
+        </w:tc>
+        <w:tc>
+          <w:tcPr>
+            <w:tcW w:w="5188" w:type="dxa"/>
+          </w:tcPr>
+          <w:p>
+            <w:pPr>
+              <w:pStyle w:val="NoSpacing"/>
+              <w:cnfStyle w:val="000000100000" w:firstRow="0" w:lastRow="0" w:firstColumn="0" w:lastColumn="0" w:oddVBand="0" w:evenVBand="0" w:oddHBand="1" w:evenHBand="0" w:firstRowFirstColumn="0" w:firstRowLastColumn="0" w:lastRowFirstColumn="0" w:lastRowLastColumn="0"/>
+              <w:rPr>
+                <w:sz w:val="18"/>
+                <w:szCs w:val="18"/>
+              </w:rPr>
+            </w:pPr>
+            <w:r>
+              <w:rPr>
+                <w:sz w:val="18"/>
+                <w:szCs w:val="18"/>
+              </w:rPr>
+              <w:t>Initial publication.</w:t>
+            </w:r>
+          </w:p>
+        </w:tc>
+      </w:tr>
+      <w:tr>
+        <w:tc>
+          <w:tcPr>
+            <w:cnfStyle w:val="001000000000" w:firstRow="0" w:lastRow="0" w:firstColumn="1" w:lastColumn="0" w:oddVBand="0" w:evenVBand="0" w:oddHBand="0" w:evenHBand="0" w:firstRowFirstColumn="0" w:firstRowLastColumn="0" w:lastRowFirstColumn="0" w:lastRowLastColumn="0"/>
+            <w:tcW w:w="882" w:type="dxa"/>
+          </w:tcPr>
+          <w:p>
+            <w:pPr>
+              <w:pStyle w:val="NoSpacing"/>
+              <w:rPr>
+                <w:b w:val="0"/>
+                <w:bCs w:val="0"/>
+                <w:sz w:val="18"/>
+                <w:szCs w:val="18"/>
+              </w:rPr>
+            </w:pPr>
+            <w:r>
+              <w:rPr>
+                <w:b w:val="0"/>
+                <w:bCs w:val="0"/>
+                <w:sz w:val="18"/>
+                <w:szCs w:val="18"/>
+              </w:rPr>
+              <w:t>1.1</w:t>
+            </w:r>
+          </w:p>
+        </w:tc>
+        <w:tc>
+          <w:tcPr>
+            <w:tcW w:w="1807" w:type="dxa"/>
+          </w:tcPr>
+          <w:p>
+            <w:pPr>
+              <w:pStyle w:val="NoSpacing"/>
+              <w:cnfStyle w:val="000000000000" w:firstRow="0" w:lastRow="0" w:firstColumn="0" w:lastColumn="0" w:oddVBand="0" w:evenVBand="0" w:oddHBand="0" w:evenHBand="0" w:firstRowFirstColumn="0" w:firstRowLastColumn="0" w:lastRowFirstColumn="0" w:lastRowLastColumn="0"/>
+              <w:rPr>
+                <w:sz w:val="18"/>
+                <w:szCs w:val="18"/>
+              </w:rPr>
+            </w:pPr>
+            <w:r>
+              <w:rPr>
+                <w:sz w:val="18"/>
+                <w:szCs w:val="18"/>
+              </w:rPr>
+              <w:t>27 February 2026</w:t>
+            </w:r>
+          </w:p>
+        </w:tc>
+        <w:tc>
+          <w:tcPr>
+            <w:tcW w:w="1134" w:type="dxa"/>
+          </w:tcPr>
+          <w:p>
+            <w:pPr>
+              <w:pStyle w:val="NoSpacing"/>
+              <w:cnfStyle w:val="000000000000" w:firstRow="0" w:lastRow="0" w:firstColumn="0" w:lastColumn="0" w:oddVBand="0" w:evenVBand="0" w:oddHBand="0" w:evenHBand="0" w:firstRowFirstColumn="0" w:firstRowLastColumn="0" w:lastRowFirstColumn="0" w:lastRowLastColumn="0"/>
+              <w:rPr>
+                <w:sz w:val="18"/>
+                <w:szCs w:val="18"/>
+              </w:rPr>
+            </w:pPr>
+            <w:r>
+              <w:rPr>
+                <w:sz w:val="18"/>
+                <w:szCs w:val="18"/>
+              </w:rPr>
+              <w:t>Published</w:t>
+            </w:r>
+          </w:p>
+        </w:tc>
+        <w:tc>
+          <w:tcPr>
+            <w:tcW w:w="5188" w:type="dxa"/>
+          </w:tcPr>
+          <w:p>
+            <w:pPr>
+              <w:pStyle w:val="NoSpacing"/>
+              <w:cnfStyle w:val="000000000000" w:firstRow="0" w:lastRow="0" w:firstColumn="0" w:lastColumn="0" w:oddVBand="0" w:evenVBand="0" w:oddHBand="0" w:evenHBand="0" w:firstRowFirstColumn="0" w:firstRowLastColumn="0" w:lastRowFirstColumn="0" w:lastRowLastColumn="0"/>
+              <w:rPr>
+                <w:sz w:val="18"/>
+                <w:szCs w:val="18"/>
+              </w:rPr>
+            </w:pPr>
+            <w:r>
+              <w:rPr>
+                <w:sz w:val="18"/>
+                <w:szCs w:val="18"/>
+              </w:rPr>
+              <w:t>A</w:t>
+            </w:r>
+            <w:r>
+              <w:rPr>
+                <w:sz w:val="18"/>
+                <w:szCs w:val="18"/>
+              </w:rPr>
+              <w:t>dded Section 2.3 — What This Proposal Does Not Solve — clarifying that the _</w:t>
+            </w:r>
+            <w:proofErr w:type="spellStart"/>
+            <w:r>
+              <w:rPr>
+                <w:sz w:val="18"/>
+                <w:szCs w:val="18"/>
+              </w:rPr>
+              <w:t>mcp</w:t>
+            </w:r>
+            <w:proofErr w:type="spellEnd"/>
+            <w:r>
+              <w:rPr>
+                <w:sz w:val="18"/>
+                <w:szCs w:val="18"/>
+              </w:rPr>
+              <w:t xml:space="preserve"> DNS record addresses discovery only, and that authentication, authorisation, and tool capability enumeration are explicitly out of scope for the DNS layer.</w:t>
+            </w:r>
+          </w:p>
+        </w:tc>
+      </w:tr>
+    </w:tbl>
+    <w:p/>
+    <w:p/>
+    <w:p>
       <w:r>
         <w:rPr>
           <w:szCs w:val="22"/>
@@ -326,10 +690,7 @@
       <w:bookmarkStart w:id="1" w:name="_Toc222990640"/>
       <w:r>
         <w:lastRenderedPageBreak/>
-        <w:t xml:space="preserve">1. </w:t>
-      </w:r>
-      <w:r>
-        <w:t xml:space="preserve">The </w:t>
+        <w:t xml:space="preserve">1. The </w:t>
       </w:r>
       <w:r>
         <w:t>Problem</w:t>
@@ -660,6 +1021,94 @@
     </w:p>
     <w:p>
       <w:pPr>
+        <w:pStyle w:val="Heading2"/>
+      </w:pPr>
+      <w:r>
+        <w:t>2.3  What This Proposal Does Not Solve</w:t>
+      </w:r>
+    </w:p>
+    <w:p>
+      <w:pPr>
+        <w:rPr>
+          <w:szCs w:val="22"/>
+        </w:rPr>
+      </w:pPr>
+      <w:r>
+        <w:rPr>
+          <w:szCs w:val="22"/>
+        </w:rPr>
+        <w:t>This proposal solves discovery. It does not solve authentication, authorisation, or capability enumeration — and it is important to be precise about why.</w:t>
+      </w:r>
+    </w:p>
+    <w:p>
+      <w:pPr>
+        <w:rPr>
+          <w:szCs w:val="22"/>
+        </w:rPr>
+      </w:pPr>
+      <w:r>
+        <w:rPr>
+          <w:szCs w:val="22"/>
+        </w:rPr>
+        <w:t>The _</w:t>
+      </w:r>
+      <w:proofErr w:type="spellStart"/>
+      <w:r>
+        <w:rPr>
+          <w:szCs w:val="22"/>
+        </w:rPr>
+        <w:t>mcp</w:t>
+      </w:r>
+      <w:proofErr w:type="spellEnd"/>
+      <w:r>
+        <w:rPr>
+          <w:szCs w:val="22"/>
+        </w:rPr>
+        <w:t xml:space="preserve"> DNS record is a naming convention. It tells a compliant agent where to find an organisation's MCP registry. It does not tell the agent whether it is permitted to connect, and it does not authenticate either party. The auth= field in the record is a pointer to a token endpoint — it is a signpost, not a gate. Authentication and authorisation remain the responsibility of the registry and of each individual MCP server. This paper describes one approach to registry-level authentication using RS256 JWT validation at the </w:t>
+      </w:r>
+      <w:proofErr w:type="spellStart"/>
+      <w:r>
+        <w:rPr>
+          <w:szCs w:val="22"/>
+        </w:rPr>
+        <w:t>Lambda@Edge</w:t>
+      </w:r>
+      <w:proofErr w:type="spellEnd"/>
+      <w:r>
+        <w:rPr>
+          <w:szCs w:val="22"/>
+        </w:rPr>
+        <w:t xml:space="preserve"> layer; that is an implementation choice, not a property of the DNS record itself.</w:t>
+      </w:r>
+    </w:p>
+    <w:p>
+      <w:pPr>
+        <w:rPr>
+          <w:szCs w:val="22"/>
+        </w:rPr>
+      </w:pPr>
+      <w:r>
+        <w:rPr>
+          <w:szCs w:val="22"/>
+        </w:rPr>
+        <w:t>The registry lists servers, not the capabilities beneath them. An agent that discovers the registry and retrieves the server manifest knows which MCP servers exist and where to connect. It does not yet know what any of those servers can do. Tool enumeration — the actual capabilities an agent can invoke — requires a subsequent tools/list call to each individual server. Discovery and capability enumeration are sequential steps, not a single operation. The DNS record initiates the first step only.</w:t>
+      </w:r>
+    </w:p>
+    <w:p>
+      <w:pPr>
+        <w:rPr>
+          <w:szCs w:val="22"/>
+        </w:rPr>
+      </w:pPr>
+      <w:r>
+        <w:rPr>
+          <w:szCs w:val="22"/>
+        </w:rPr>
+        <w:t>This layering is intentional. DNS is the right primitive for the discovery problem precisely because it is lightweight, globally distributed, and operationally well-understood. Extending it to carry authentication state or capability manifests would undermine those properties. Each layer should do one thing well.</w:t>
+      </w:r>
+    </w:p>
+    <w:p>
+      <w:pPr>
         <w:spacing w:after="0" w:line="240" w:lineRule="auto"/>
         <w:rPr>
           <w:rFonts w:ascii="Source Serif 4 SemiBold" w:eastAsiaTheme="majorEastAsia" w:hAnsi="Source Serif 4 SemiBold" w:cstheme="majorBidi"/>
@@ -1835,14 +2284,7 @@
                 <w:sz w:val="18"/>
                 <w:szCs w:val="18"/>
               </w:rPr>
-              <w:t xml:space="preserve">        </w:t>
-            </w:r>
-            <w:r>
-              <w:rPr>
-                <w:sz w:val="18"/>
-                <w:szCs w:val="18"/>
-              </w:rPr>
-              <w:t>"name": "CRM Read-Only Access",</w:t>
+              <w:t xml:space="preserve">        "name": "CRM Read-Only Access",</w:t>
             </w:r>
           </w:p>
           <w:p>
@@ -2500,57 +2942,25 @@
                 <w:sz w:val="18"/>
                 <w:szCs w:val="18"/>
               </w:rPr>
-              <w:t xml:space="preserve">                                </w:t>
-            </w:r>
-            <w:r>
-              <w:rPr>
-                <w:rFonts w:ascii="IBM Plex Mono" w:hAnsi="IBM Plex Mono"/>
-                <w:sz w:val="18"/>
-                <w:szCs w:val="18"/>
-              </w:rPr>
-              <w:t>to this client,</w:t>
-            </w:r>
-            <w:r>
-              <w:rPr>
-                <w:rFonts w:ascii="IBM Plex Mono" w:hAnsi="IBM Plex Mono"/>
-                <w:sz w:val="18"/>
-                <w:szCs w:val="18"/>
-              </w:rPr>
-              <w:t xml:space="preserve"> </w:t>
-            </w:r>
-            <w:r>
-              <w:rPr>
-                <w:rFonts w:ascii="IBM Plex Mono" w:hAnsi="IBM Plex Mono"/>
-                <w:sz w:val="18"/>
-                <w:szCs w:val="18"/>
-              </w:rPr>
-              <w:t xml:space="preserve">filtered by </w:t>
-            </w:r>
-          </w:p>
-          <w:p>
-            <w:pPr>
-              <w:pStyle w:val="NoSpacing"/>
-              <w:rPr>
-                <w:rFonts w:ascii="IBM Plex Mono" w:hAnsi="IBM Plex Mono"/>
-                <w:sz w:val="18"/>
-                <w:szCs w:val="18"/>
-              </w:rPr>
-            </w:pPr>
-            <w:r>
-              <w:rPr>
-                <w:rFonts w:ascii="IBM Plex Mono" w:hAnsi="IBM Plex Mono"/>
-                <w:sz w:val="18"/>
-                <w:szCs w:val="18"/>
-              </w:rPr>
-              <w:t xml:space="preserve">                                </w:t>
-            </w:r>
-            <w:r>
-              <w:rPr>
-                <w:rFonts w:ascii="IBM Plex Mono" w:hAnsi="IBM Plex Mono"/>
-                <w:sz w:val="18"/>
-                <w:szCs w:val="18"/>
-              </w:rPr>
-              <w:t xml:space="preserve">authentication status.", </w:t>
+              <w:t xml:space="preserve">                                to this client, filtered by </w:t>
+            </w:r>
+          </w:p>
+          <w:p>
+            <w:pPr>
+              <w:pStyle w:val="NoSpacing"/>
+              <w:rPr>
+                <w:rFonts w:ascii="IBM Plex Mono" w:hAnsi="IBM Plex Mono"/>
+                <w:sz w:val="18"/>
+                <w:szCs w:val="18"/>
+              </w:rPr>
+            </w:pPr>
+            <w:r>
+              <w:rPr>
+                <w:rFonts w:ascii="IBM Plex Mono" w:hAnsi="IBM Plex Mono"/>
+                <w:sz w:val="18"/>
+                <w:szCs w:val="18"/>
+              </w:rPr>
+              <w:t xml:space="preserve">                                authentication status.", </w:t>
             </w:r>
           </w:p>
           <w:p>
@@ -2722,41 +3132,25 @@
                 <w:sz w:val="18"/>
                 <w:szCs w:val="18"/>
               </w:rPr>
-              <w:t xml:space="preserve">                                            </w:t>
-            </w:r>
-            <w:r>
-              <w:rPr>
-                <w:rFonts w:ascii="IBM Plex Mono" w:hAnsi="IBM Plex Mono"/>
-                <w:sz w:val="18"/>
-                <w:szCs w:val="18"/>
-              </w:rPr>
-              <w:t xml:space="preserve">servers by capability </w:t>
-            </w:r>
-          </w:p>
-          <w:p>
-            <w:pPr>
-              <w:pStyle w:val="NoSpacing"/>
-              <w:rPr>
-                <w:rFonts w:ascii="IBM Plex Mono" w:hAnsi="IBM Plex Mono"/>
-                <w:sz w:val="18"/>
-                <w:szCs w:val="18"/>
-              </w:rPr>
-            </w:pPr>
-            <w:r>
-              <w:rPr>
-                <w:rFonts w:ascii="IBM Plex Mono" w:hAnsi="IBM Plex Mono"/>
-                <w:sz w:val="18"/>
-                <w:szCs w:val="18"/>
-              </w:rPr>
-              <w:t xml:space="preserve">                                            </w:t>
-            </w:r>
-            <w:r>
-              <w:rPr>
-                <w:rFonts w:ascii="IBM Plex Mono" w:hAnsi="IBM Plex Mono"/>
-                <w:sz w:val="18"/>
-                <w:szCs w:val="18"/>
-              </w:rPr>
-              <w:t xml:space="preserve">tag." </w:t>
+              <w:t xml:space="preserve">                                            servers by capability </w:t>
+            </w:r>
+          </w:p>
+          <w:p>
+            <w:pPr>
+              <w:pStyle w:val="NoSpacing"/>
+              <w:rPr>
+                <w:rFonts w:ascii="IBM Plex Mono" w:hAnsi="IBM Plex Mono"/>
+                <w:sz w:val="18"/>
+                <w:szCs w:val="18"/>
+              </w:rPr>
+            </w:pPr>
+            <w:r>
+              <w:rPr>
+                <w:rFonts w:ascii="IBM Plex Mono" w:hAnsi="IBM Plex Mono"/>
+                <w:sz w:val="18"/>
+                <w:szCs w:val="18"/>
+              </w:rPr>
+              <w:t xml:space="preserve">                                            tag." </w:t>
             </w:r>
           </w:p>
           <w:p>
@@ -2918,15 +3312,7 @@
                 <w:sz w:val="18"/>
                 <w:szCs w:val="18"/>
               </w:rPr>
-              <w:t xml:space="preserve">                                </w:t>
-            </w:r>
-            <w:r>
-              <w:rPr>
-                <w:rFonts w:ascii="IBM Plex Mono" w:hAnsi="IBM Plex Mono"/>
-                <w:sz w:val="18"/>
-                <w:szCs w:val="18"/>
-              </w:rPr>
-              <w:t xml:space="preserve">for a specific server.", </w:t>
+              <w:t xml:space="preserve">                                for a specific server.", </w:t>
             </w:r>
           </w:p>
           <w:p>
@@ -3325,41 +3711,25 @@
                 <w:sz w:val="18"/>
                 <w:szCs w:val="18"/>
               </w:rPr>
-              <w:t xml:space="preserve">                                </w:t>
-            </w:r>
-            <w:r>
-              <w:rPr>
-                <w:rFonts w:ascii="IBM Plex Mono" w:hAnsi="IBM Plex Mono"/>
-                <w:sz w:val="18"/>
-                <w:szCs w:val="18"/>
-              </w:rPr>
-              <w:t xml:space="preserve">capability, data type, or </w:t>
-            </w:r>
-          </w:p>
-          <w:p>
-            <w:pPr>
-              <w:pStyle w:val="NoSpacing"/>
-              <w:rPr>
-                <w:rFonts w:ascii="IBM Plex Mono" w:hAnsi="IBM Plex Mono"/>
-                <w:sz w:val="18"/>
-                <w:szCs w:val="18"/>
-              </w:rPr>
-            </w:pPr>
-            <w:r>
-              <w:rPr>
-                <w:rFonts w:ascii="IBM Plex Mono" w:hAnsi="IBM Plex Mono"/>
-                <w:sz w:val="18"/>
-                <w:szCs w:val="18"/>
-              </w:rPr>
-              <w:t xml:space="preserve">                                </w:t>
-            </w:r>
-            <w:r>
-              <w:rPr>
-                <w:rFonts w:ascii="IBM Plex Mono" w:hAnsi="IBM Plex Mono"/>
-                <w:sz w:val="18"/>
-                <w:szCs w:val="18"/>
-              </w:rPr>
-              <w:t xml:space="preserve">keyword.", </w:t>
+              <w:t xml:space="preserve">                                capability, data type, or </w:t>
+            </w:r>
+          </w:p>
+          <w:p>
+            <w:pPr>
+              <w:pStyle w:val="NoSpacing"/>
+              <w:rPr>
+                <w:rFonts w:ascii="IBM Plex Mono" w:hAnsi="IBM Plex Mono"/>
+                <w:sz w:val="18"/>
+                <w:szCs w:val="18"/>
+              </w:rPr>
+            </w:pPr>
+            <w:r>
+              <w:rPr>
+                <w:rFonts w:ascii="IBM Plex Mono" w:hAnsi="IBM Plex Mono"/>
+                <w:sz w:val="18"/>
+                <w:szCs w:val="18"/>
+              </w:rPr>
+              <w:t xml:space="preserve">                                keyword.", </w:t>
             </w:r>
           </w:p>
           <w:p>
@@ -3683,15 +4053,7 @@
                 <w:sz w:val="18"/>
                 <w:szCs w:val="18"/>
               </w:rPr>
-              <w:t xml:space="preserve">                                </w:t>
-            </w:r>
-            <w:r>
-              <w:rPr>
-                <w:rFonts w:ascii="IBM Plex Mono" w:hAnsi="IBM Plex Mono"/>
-                <w:sz w:val="18"/>
-                <w:szCs w:val="18"/>
-              </w:rPr>
-              <w:t xml:space="preserve">of a server.", </w:t>
+              <w:t xml:space="preserve">                                of a server.", </w:t>
             </w:r>
           </w:p>
           <w:p>
@@ -12587,55 +12949,31 @@
               <w:pStyle w:val="NoSpacing"/>
             </w:pPr>
             <w:r>
-              <w:t>DNS record:</w:t>
-            </w:r>
-            <w:r>
-              <w:t xml:space="preserve">          </w:t>
-            </w:r>
-            <w:r>
-              <w:t>_mcp.mariothomas.com</w:t>
-            </w:r>
-          </w:p>
-          <w:p>
-            <w:pPr>
-              <w:pStyle w:val="NoSpacing"/>
-            </w:pPr>
-            <w:r>
-              <w:t xml:space="preserve">Registry:       </w:t>
-            </w:r>
-            <w:r>
-              <w:t xml:space="preserve">         </w:t>
-            </w:r>
-            <w:r>
-              <w:t>https://mcp.mariothomas.com/registry</w:t>
-            </w:r>
-          </w:p>
-          <w:p>
-            <w:pPr>
-              <w:pStyle w:val="NoSpacing"/>
-            </w:pPr>
-            <w:r>
-              <w:t xml:space="preserve">Articles MCP:   </w:t>
-            </w:r>
-            <w:r>
-              <w:t xml:space="preserve">     </w:t>
-            </w:r>
-            <w:r>
-              <w:t>https://mcp.mariothomas.com/articles    (public)</w:t>
-            </w:r>
-          </w:p>
-          <w:p>
-            <w:pPr>
-              <w:pStyle w:val="NoSpacing"/>
-            </w:pPr>
-            <w:r>
-              <w:t xml:space="preserve">Locations MCP:  </w:t>
-            </w:r>
-            <w:r>
-              <w:t xml:space="preserve">  </w:t>
-            </w:r>
-            <w:r>
-              <w:t>https://mcp.mariothomas.com/locations   (public)</w:t>
+              <w:t>DNS record:          _mcp.mariothomas.com</w:t>
+            </w:r>
+          </w:p>
+          <w:p>
+            <w:pPr>
+              <w:pStyle w:val="NoSpacing"/>
+            </w:pPr>
+            <w:r>
+              <w:t>Registry:                https://mcp.mariothomas.com/registry</w:t>
+            </w:r>
+          </w:p>
+          <w:p>
+            <w:pPr>
+              <w:pStyle w:val="NoSpacing"/>
+            </w:pPr>
+            <w:r>
+              <w:t>Articles MCP:        https://mcp.mariothomas.com/articles    (public)</w:t>
+            </w:r>
+          </w:p>
+          <w:p>
+            <w:pPr>
+              <w:pStyle w:val="NoSpacing"/>
+            </w:pPr>
+            <w:r>
+              <w:t>Locations MCP:    https://mcp.mariothomas.com/locations   (public)</w:t>
             </w:r>
           </w:p>
           <w:p>
@@ -12651,25 +12989,7 @@
               <w:pStyle w:val="NoSpacing"/>
             </w:pPr>
             <w:r>
-              <w:t xml:space="preserve">Source code:   </w:t>
-            </w:r>
-            <w:r>
-              <w:t xml:space="preserve"> </w:t>
-            </w:r>
-            <w:r>
-              <w:t xml:space="preserve"> </w:t>
-            </w:r>
-            <w:r>
-              <w:t xml:space="preserve">   </w:t>
-            </w:r>
-            <w:r>
-              <w:t>https://github.com/mariothomas/mcp-</w:t>
-            </w:r>
-            <w:r>
-              <w:t>dns-</w:t>
-            </w:r>
-            <w:r>
-              <w:t>registry (link at publication)</w:t>
+              <w:t>Source code:        https://github.com/mariothomas/mcp-dns-registry (link at publication)</w:t>
             </w:r>
           </w:p>
         </w:tc>
@@ -13483,13 +13803,7 @@
       </w:pPr>
       <w:r>
         <w:lastRenderedPageBreak/>
-        <w:t>12.</w:t>
-      </w:r>
-      <w:r>
-        <w:t>4</w:t>
-      </w:r>
-      <w:r>
-        <w:t xml:space="preserve">  </w:t>
+        <w:t xml:space="preserve">12.4  </w:t>
       </w:r>
       <w:r>
         <w:t>Server 2: Locations and Dates (Public)</w:t>
@@ -13857,13 +14171,7 @@
         <w:pStyle w:val="Heading2"/>
       </w:pPr>
       <w:r>
-        <w:t>12.</w:t>
-      </w:r>
-      <w:r>
-        <w:t>5</w:t>
-      </w:r>
-      <w:r>
-        <w:t xml:space="preserve">  </w:t>
+        <w:t xml:space="preserve">12.5  </w:t>
       </w:r>
       <w:r>
         <w:t>Server 3: Private Documents (Private)</w:t>

</xml_diff>

<commit_message>
MCP Registry Architecture v1.2
Extended Section 7.4 to address registry-level content filtering
as a mitigation for prompt injection attacks, drawing on the DNS
reputation services analogy.

Added Section 10.6 — Agent Peer Discovery: A Natural Extension —
sketching the /.well-known/mcp peer discovery model, referencing
WebRTC and data mesh parallels, and positioning direct agent
capability advertisement as a complementary layer to the registry
architecture.

Added Acknowledgements section crediting Jonathan Jenkyn and
Jonathan Taws for peer review contributions.

Document history updated.
</commit_message>
<xml_diff>
--- a/paper/mcp-registry-architecture.docx
+++ b/paper/mcp-registry-architecture.docx
@@ -208,7 +208,7 @@
           <w:rFonts w:ascii="Source Serif 4 ExtraLight" w:hAnsi="Source Serif 4 ExtraLight"/>
           <w:szCs w:val="22"/>
         </w:rPr>
-        <w:t>1</w:t>
+        <w:t>2</w:t>
       </w:r>
     </w:p>
     <w:p>
@@ -231,7 +231,7 @@
           <w:rFonts w:ascii="Source Serif 4 ExtraLight" w:hAnsi="Source Serif 4 ExtraLight"/>
           <w:szCs w:val="22"/>
         </w:rPr>
-        <w:t>7</w:t>
+        <w:t>8</w:t>
       </w:r>
       <w:r>
         <w:rPr>
@@ -668,6 +668,118 @@
                 <w:szCs w:val="18"/>
               </w:rPr>
               <w:t xml:space="preserve"> DNS record addresses discovery only, and that authentication, authorisation, and tool capability enumeration are explicitly out of scope for the DNS layer.</w:t>
+            </w:r>
+          </w:p>
+        </w:tc>
+      </w:tr>
+      <w:tr>
+        <w:trPr>
+          <w:cnfStyle w:val="000000100000" w:firstRow="0" w:lastRow="0" w:firstColumn="0" w:lastColumn="0" w:oddVBand="0" w:evenVBand="0" w:oddHBand="1" w:evenHBand="0" w:firstRowFirstColumn="0" w:firstRowLastColumn="0" w:lastRowFirstColumn="0" w:lastRowLastColumn="0"/>
+        </w:trPr>
+        <w:tc>
+          <w:tcPr>
+            <w:cnfStyle w:val="001000000000" w:firstRow="0" w:lastRow="0" w:firstColumn="1" w:lastColumn="0" w:oddVBand="0" w:evenVBand="0" w:oddHBand="0" w:evenHBand="0" w:firstRowFirstColumn="0" w:firstRowLastColumn="0" w:lastRowFirstColumn="0" w:lastRowLastColumn="0"/>
+            <w:tcW w:w="882" w:type="dxa"/>
+          </w:tcPr>
+          <w:p>
+            <w:pPr>
+              <w:pStyle w:val="NoSpacing"/>
+              <w:rPr>
+                <w:b w:val="0"/>
+                <w:bCs w:val="0"/>
+                <w:sz w:val="18"/>
+                <w:szCs w:val="18"/>
+              </w:rPr>
+            </w:pPr>
+            <w:r>
+              <w:rPr>
+                <w:b w:val="0"/>
+                <w:bCs w:val="0"/>
+                <w:sz w:val="18"/>
+                <w:szCs w:val="18"/>
+              </w:rPr>
+              <w:t>1.2</w:t>
+            </w:r>
+          </w:p>
+        </w:tc>
+        <w:tc>
+          <w:tcPr>
+            <w:tcW w:w="1807" w:type="dxa"/>
+          </w:tcPr>
+          <w:p>
+            <w:pPr>
+              <w:pStyle w:val="NoSpacing"/>
+              <w:cnfStyle w:val="000000100000" w:firstRow="0" w:lastRow="0" w:firstColumn="0" w:lastColumn="0" w:oddVBand="0" w:evenVBand="0" w:oddHBand="1" w:evenHBand="0" w:firstRowFirstColumn="0" w:firstRowLastColumn="0" w:lastRowFirstColumn="0" w:lastRowLastColumn="0"/>
+              <w:rPr>
+                <w:sz w:val="18"/>
+                <w:szCs w:val="18"/>
+              </w:rPr>
+            </w:pPr>
+            <w:r>
+              <w:rPr>
+                <w:sz w:val="18"/>
+                <w:szCs w:val="18"/>
+              </w:rPr>
+              <w:t>28 February 2026</w:t>
+            </w:r>
+          </w:p>
+        </w:tc>
+        <w:tc>
+          <w:tcPr>
+            <w:tcW w:w="1134" w:type="dxa"/>
+          </w:tcPr>
+          <w:p>
+            <w:pPr>
+              <w:pStyle w:val="NoSpacing"/>
+              <w:cnfStyle w:val="000000100000" w:firstRow="0" w:lastRow="0" w:firstColumn="0" w:lastColumn="0" w:oddVBand="0" w:evenVBand="0" w:oddHBand="1" w:evenHBand="0" w:firstRowFirstColumn="0" w:firstRowLastColumn="0" w:lastRowFirstColumn="0" w:lastRowLastColumn="0"/>
+              <w:rPr>
+                <w:sz w:val="18"/>
+                <w:szCs w:val="18"/>
+              </w:rPr>
+            </w:pPr>
+            <w:r>
+              <w:rPr>
+                <w:sz w:val="18"/>
+                <w:szCs w:val="18"/>
+              </w:rPr>
+              <w:t>Published</w:t>
+            </w:r>
+          </w:p>
+        </w:tc>
+        <w:tc>
+          <w:tcPr>
+            <w:tcW w:w="5188" w:type="dxa"/>
+          </w:tcPr>
+          <w:p>
+            <w:pPr>
+              <w:pStyle w:val="NoSpacing"/>
+              <w:cnfStyle w:val="000000100000" w:firstRow="0" w:lastRow="0" w:firstColumn="0" w:lastColumn="0" w:oddVBand="0" w:evenVBand="0" w:oddHBand="1" w:evenHBand="0" w:firstRowFirstColumn="0" w:firstRowLastColumn="0" w:lastRowFirstColumn="0" w:lastRowLastColumn="0"/>
+              <w:rPr>
+                <w:sz w:val="18"/>
+                <w:szCs w:val="18"/>
+              </w:rPr>
+            </w:pPr>
+            <w:r>
+              <w:t xml:space="preserve">Extended Section 7.4 to address registry-level content filtering as a mitigation for prompt injection attacks, drawing on the DNS reputation services analogy. Added Section 10.6 — Agent Peer Discovery: A Natural Extension — sketching the </w:t>
+            </w:r>
+            <w:r>
+              <w:rPr>
+                <w:rStyle w:val="HTMLCode"/>
+                <w:rFonts w:eastAsiaTheme="majorEastAsia"/>
+              </w:rPr>
+              <w:t>/.well-known/</w:t>
+            </w:r>
+            <w:proofErr w:type="spellStart"/>
+            <w:r>
+              <w:rPr>
+                <w:rStyle w:val="HTMLCode"/>
+                <w:rFonts w:eastAsiaTheme="majorEastAsia"/>
+              </w:rPr>
+              <w:t>mcp</w:t>
+            </w:r>
+            <w:proofErr w:type="spellEnd"/>
+            <w:r>
+              <w:t xml:space="preserve"> peer discovery model, referencing WebRTC and data mesh parallels, and positioning direct agent capability advertisement as a complementary layer to the registry architecture. Acknowledgements section added.</w:t>
             </w:r>
           </w:p>
         </w:tc>
@@ -6133,6 +6245,15 @@
       <w:proofErr w:type="gramEnd"/>
       <w:r>
         <w:t xml:space="preserve"> strict input validation on all DynamoDB writes, limiting the length and character set of free-text fields, and treating all registry content as untrusted input in the agent's reasoning pipeline. Agents should not execute instructions embedded in tool descriptions; they should use those descriptions only to reason about which tool to invoke.</w:t>
+      </w:r>
+    </w:p>
+    <w:p>
+      <w:r>
+        <w:t xml:space="preserve">As the MCP ecosystem matures, registry-level content filtering services will likely emerge — analogous to DNS reputation services such as Cisco Umbrella or Cloudflare Gateway, which maintain continuously updated lists of known malicious domains and block responses before they reach the client. The equivalent for MCP registries would be a content validation layer that inspects capability descriptions, server names, and free-text fields against known malicious patterns before entries are written to the registry and before they are returned to agents. Organisations operating registries at scale should design their write path to accommodate such a filtering layer — a validation step between the pull request approval and the DynamoDB write that can be updated independently of the registry infrastructure itself. This is not a requirement for initial deployment, but it is the right seam to build into the architecture from the start. Agents consuming registry content should treat all free-text fields as untrusted input regardless </w:t>
+      </w:r>
+      <w:r>
+        <w:lastRenderedPageBreak/>
+        <w:t>of the registry's apparent reputation, applying the same scepticism a well-configured DNS resolver applies to every response it receives.</w:t>
       </w:r>
     </w:p>
     <w:p>
@@ -12720,6 +12841,117 @@
     </w:p>
     <w:p>
       <w:pPr>
+        <w:pStyle w:val="Heading2"/>
+      </w:pPr>
+      <w:r>
+        <w:t>10.6  Agent Peer Discovery: A Natural Extension</w:t>
+      </w:r>
+    </w:p>
+    <w:p>
+      <w:r>
+        <w:t>The registry model described in this paper is centralised by design. An organisation operates a registry; agents query it to discover available servers. This is the right model for enterprise MCP deployments where governance, access control, and auditability are primary concerns. But it is not the only possible model, and the DNS convention described here points naturally toward a complementary peer discovery layer that does not require a registry intermediary at all.</w:t>
+      </w:r>
+    </w:p>
+    <w:p>
+      <w:r>
+        <w:t>The extension is straightforward in concept. Rather than — or in addition to — publishing a registry at the URL advertised in the _</w:t>
+      </w:r>
+      <w:proofErr w:type="spellStart"/>
+      <w:r>
+        <w:t>mcp</w:t>
+      </w:r>
+      <w:proofErr w:type="spellEnd"/>
+      <w:r>
+        <w:t xml:space="preserve"> DNS record, an agent or service could publish its own capability manifest directly at a well-known HTTP path: /.well-known/</w:t>
+      </w:r>
+      <w:proofErr w:type="spellStart"/>
+      <w:r>
+        <w:t>mcp</w:t>
+      </w:r>
+      <w:proofErr w:type="spellEnd"/>
+      <w:r>
+        <w:t>. Any other agent that knows the domain can query this path and discover what that agent can do, without consulting a central registry. The _</w:t>
+      </w:r>
+      <w:proofErr w:type="spellStart"/>
+      <w:r>
+        <w:t>mcp</w:t>
+      </w:r>
+      <w:proofErr w:type="spellEnd"/>
+      <w:r>
+        <w:t xml:space="preserve"> DNS record bootstraps the initial discovery; the /.well-known/</w:t>
+      </w:r>
+      <w:proofErr w:type="spellStart"/>
+      <w:r>
+        <w:t>mcp</w:t>
+      </w:r>
+      <w:proofErr w:type="spellEnd"/>
+      <w:r>
+        <w:t xml:space="preserve"> path serves the capability manifest directly. No intermediary required.</w:t>
+      </w:r>
+    </w:p>
+    <w:p>
+      <w:r>
+        <w:lastRenderedPageBreak/>
+        <w:t>This maps to a peer-to-peer discovery model that several developments in the agent ecosystem are converging toward. Google's Agent-to-Agent protocol already anticipates agents calling each other directly rather than routing all interactions through MCP registries. The original vision of WebRTC — browsers connecting peer-to-peer for audio and video without a centralised media server — provides a useful historical parallel: the peer-to-peer capability was architecturally sound even if signalling infrastructure emerged in practice to handle NAT traversal and session coordination. Similarly, a peer discovery layer for agents does not eliminate the value of registries; it adds a complementary primitive that agents can use when they already know a domain and want to discover capabilities directly.</w:t>
+      </w:r>
+    </w:p>
+    <w:p>
+      <w:r>
+        <w:t>The data mesh parallel is equally instructive. In a data mesh architecture, data products are owned and published by the teams that produce them rather than registered in a central catalogue maintained by a platform team. Discoverability is a property of the data product itself, not a function of a central registry. The equivalent for agents would be agents owning and publishing their own capability manifests — making discoverability a property of the agent rather than a function of the registry it happens to be listed in. This shifts the governance model from registry-centric to agent-centric, with the _</w:t>
+      </w:r>
+      <w:proofErr w:type="spellStart"/>
+      <w:r>
+        <w:t>mcp</w:t>
+      </w:r>
+      <w:proofErr w:type="spellEnd"/>
+      <w:r>
+        <w:t xml:space="preserve"> DNS convention providing the common naming layer that makes peer discovery work across organisational boundaries.</w:t>
+      </w:r>
+    </w:p>
+    <w:p>
+      <w:r>
+        <w:t>The extension also generalises beyond agents. The same /.well-known/</w:t>
+      </w:r>
+      <w:proofErr w:type="spellStart"/>
+      <w:r>
+        <w:t>mcp</w:t>
+      </w:r>
+      <w:proofErr w:type="spellEnd"/>
+      <w:r>
+        <w:t xml:space="preserve"> path could advertise data products, knowledge bases, or any structured capability that another agent might need to discover — not just MCP servers in the current sense. As the agentic web matures, the boundary between an agent, a data product, and a knowledge source will blur; a discovery convention that treats </w:t>
+      </w:r>
+      <w:proofErr w:type="gramStart"/>
+      <w:r>
+        <w:t>all of</w:t>
+      </w:r>
+      <w:proofErr w:type="gramEnd"/>
+      <w:r>
+        <w:t xml:space="preserve"> these as first-class primitives is more durable than one scoped to the current MCP server taxonomy.</w:t>
+      </w:r>
+    </w:p>
+    <w:p>
+      <w:r>
+        <w:t>This peer discovery extension is explicitly out of scope for this paper, which addresses the registry bootstrap problem. It is identified here as a natural and important next layer — one that composes cleanly with the DNS convention and registry architecture described in the preceding sections rather than competing with them. The three layers stack: the _</w:t>
+      </w:r>
+      <w:proofErr w:type="spellStart"/>
+      <w:r>
+        <w:t>mcp</w:t>
+      </w:r>
+      <w:proofErr w:type="spellEnd"/>
+      <w:r>
+        <w:t xml:space="preserve"> DNS record bootstraps discovery of the registry, the registry provides governed, access-controlled enumeration of servers, and direct /.well-known/</w:t>
+      </w:r>
+      <w:proofErr w:type="spellStart"/>
+      <w:r>
+        <w:t>mcp</w:t>
+      </w:r>
+      <w:proofErr w:type="spellEnd"/>
+      <w:r>
+        <w:t xml:space="preserve"> paths enable peer-to-peer capability advertisement for agents that choose to publish themselves. Each layer is independently useful; together they form a complete discovery architecture for the agentic web.</w:t>
+      </w:r>
+    </w:p>
+    <w:p>
+      <w:pPr>
         <w:spacing w:after="0" w:line="240" w:lineRule="auto"/>
       </w:pPr>
       <w:r>
@@ -15078,6 +15310,30 @@
       <w:pPr>
         <w:spacing w:after="0" w:line="240" w:lineRule="auto"/>
       </w:pPr>
+      <w:r>
+        <w:br w:type="page"/>
+      </w:r>
+    </w:p>
+    <w:p>
+      <w:pPr>
+        <w:pStyle w:val="Heading1"/>
+      </w:pPr>
+      <w:r>
+        <w:lastRenderedPageBreak/>
+        <w:t>Acknowledgements</w:t>
+      </w:r>
+    </w:p>
+    <w:p>
+      <w:pPr>
+        <w:pStyle w:val="font-claude-response-body"/>
+      </w:pPr>
+      <w:r>
+        <w:rPr>
+          <w:rStyle w:val="Emphasis"/>
+          <w:rFonts w:eastAsiaTheme="majorEastAsia"/>
+        </w:rPr>
+        <w:t>The author thanks Jonathan Jenkyn for peer review that clarified the scope of the DNS convention with respect to authentication and authorisation, and Jonathan Taws for substantive feedback on registry security controls and the agent peer discovery extension.</w:t>
+      </w:r>
       <w:r>
         <w:br w:type="page"/>
       </w:r>
@@ -19170,6 +19426,46 @@
       </w:tcPr>
     </w:tblStylePr>
   </w:style>
+  <w:style w:type="paragraph" w:customStyle="1" w:styleId="font-claude-response-body">
+    <w:name w:val="font-claude-response-body"/>
+    <w:basedOn w:val="Normal"/>
+    <w:rsid w:val="0086145D"/>
+    <w:pPr>
+      <w:spacing w:before="100" w:beforeAutospacing="1" w:after="100" w:afterAutospacing="1" w:line="240" w:lineRule="auto"/>
+    </w:pPr>
+    <w:rPr>
+      <w:rFonts w:ascii="Times New Roman" w:eastAsia="Times New Roman" w:hAnsi="Times New Roman" w:cs="Times New Roman"/>
+      <w:color w:val="auto"/>
+      <w:kern w:val="0"/>
+      <w:sz w:val="24"/>
+      <w:lang w:eastAsia="en-GB"/>
+      <w14:ligatures w14:val="none"/>
+    </w:rPr>
+  </w:style>
+  <w:style w:type="character" w:styleId="Emphasis">
+    <w:name w:val="Emphasis"/>
+    <w:basedOn w:val="DefaultParagraphFont"/>
+    <w:uiPriority w:val="20"/>
+    <w:qFormat/>
+    <w:rsid w:val="0086145D"/>
+    <w:rPr>
+      <w:i/>
+      <w:iCs/>
+    </w:rPr>
+  </w:style>
+  <w:style w:type="character" w:styleId="HTMLCode">
+    <w:name w:val="HTML Code"/>
+    <w:basedOn w:val="DefaultParagraphFont"/>
+    <w:uiPriority w:val="99"/>
+    <w:semiHidden/>
+    <w:unhideWhenUsed/>
+    <w:rsid w:val="0086145D"/>
+    <w:rPr>
+      <w:rFonts w:ascii="Courier New" w:eastAsia="Times New Roman" w:hAnsi="Courier New" w:cs="Courier New"/>
+      <w:sz w:val="20"/>
+      <w:szCs w:val="20"/>
+    </w:rPr>
+  </w:style>
 </w:styles>
 </file>
 

</xml_diff>

<commit_message>
MCP Registry Architecture v1.3 and SPEC.md v1.3
Paper: Extended Section 8.1 to document path-based and
subdomain-based registry URL patterns as equally compliant
implementation approaches, with trade-offs and guidance
on when each is appropriate.

SPEC.md: Added Section 2.4 — Registry URL Patterns —
documenting both patterns with trade-offs. Updated Section 7
example records to show both patterns. Updated live reference
implementation example to reflect subdomain-based routing.
Version history aligned with paper document history.
</commit_message>
<xml_diff>
--- a/paper/mcp-registry-architecture.docx
+++ b/paper/mcp-registry-architecture.docx
@@ -208,7 +208,7 @@
           <w:rFonts w:ascii="Source Serif 4 ExtraLight" w:hAnsi="Source Serif 4 ExtraLight"/>
           <w:szCs w:val="22"/>
         </w:rPr>
-        <w:t>2</w:t>
+        <w:t>3</w:t>
       </w:r>
     </w:p>
     <w:p>
@@ -224,21 +224,14 @@
           <w:rFonts w:ascii="Source Serif 4 ExtraLight" w:hAnsi="Source Serif 4 ExtraLight"/>
           <w:szCs w:val="22"/>
         </w:rPr>
-        <w:t>2</w:t>
+        <w:t>2 March</w:t>
       </w:r>
       <w:r>
         <w:rPr>
           <w:rFonts w:ascii="Source Serif 4 ExtraLight" w:hAnsi="Source Serif 4 ExtraLight"/>
           <w:szCs w:val="22"/>
         </w:rPr>
-        <w:t>8</w:t>
-      </w:r>
-      <w:r>
-        <w:rPr>
-          <w:rFonts w:ascii="Source Serif 4 ExtraLight" w:hAnsi="Source Serif 4 ExtraLight"/>
-          <w:szCs w:val="22"/>
-        </w:rPr>
-        <w:t xml:space="preserve"> February 2026</w:t>
+        <w:t xml:space="preserve"> 2026</w:t>
       </w:r>
     </w:p>
     <w:p>
@@ -780,6 +773,92 @@
             <w:proofErr w:type="spellEnd"/>
             <w:r>
               <w:t xml:space="preserve"> peer discovery model, referencing WebRTC and data mesh parallels, and positioning direct agent capability advertisement as a complementary layer to the registry architecture. Acknowledgements section added.</w:t>
+            </w:r>
+          </w:p>
+        </w:tc>
+      </w:tr>
+      <w:tr>
+        <w:tc>
+          <w:tcPr>
+            <w:cnfStyle w:val="001000000000" w:firstRow="0" w:lastRow="0" w:firstColumn="1" w:lastColumn="0" w:oddVBand="0" w:evenVBand="0" w:oddHBand="0" w:evenHBand="0" w:firstRowFirstColumn="0" w:firstRowLastColumn="0" w:lastRowFirstColumn="0" w:lastRowLastColumn="0"/>
+            <w:tcW w:w="882" w:type="dxa"/>
+          </w:tcPr>
+          <w:p>
+            <w:pPr>
+              <w:pStyle w:val="NoSpacing"/>
+              <w:rPr>
+                <w:b w:val="0"/>
+                <w:bCs w:val="0"/>
+                <w:sz w:val="18"/>
+                <w:szCs w:val="18"/>
+              </w:rPr>
+            </w:pPr>
+            <w:r>
+              <w:rPr>
+                <w:b w:val="0"/>
+                <w:bCs w:val="0"/>
+                <w:sz w:val="18"/>
+                <w:szCs w:val="18"/>
+              </w:rPr>
+              <w:t>1.3</w:t>
+            </w:r>
+          </w:p>
+        </w:tc>
+        <w:tc>
+          <w:tcPr>
+            <w:tcW w:w="1807" w:type="dxa"/>
+          </w:tcPr>
+          <w:p>
+            <w:pPr>
+              <w:pStyle w:val="NoSpacing"/>
+              <w:cnfStyle w:val="000000000000" w:firstRow="0" w:lastRow="0" w:firstColumn="0" w:lastColumn="0" w:oddVBand="0" w:evenVBand="0" w:oddHBand="0" w:evenHBand="0" w:firstRowFirstColumn="0" w:firstRowLastColumn="0" w:lastRowFirstColumn="0" w:lastRowLastColumn="0"/>
+              <w:rPr>
+                <w:sz w:val="18"/>
+                <w:szCs w:val="18"/>
+              </w:rPr>
+            </w:pPr>
+            <w:r>
+              <w:rPr>
+                <w:sz w:val="18"/>
+                <w:szCs w:val="18"/>
+              </w:rPr>
+              <w:t>2 March 2026</w:t>
+            </w:r>
+          </w:p>
+        </w:tc>
+        <w:tc>
+          <w:tcPr>
+            <w:tcW w:w="1134" w:type="dxa"/>
+          </w:tcPr>
+          <w:p>
+            <w:pPr>
+              <w:pStyle w:val="NoSpacing"/>
+              <w:cnfStyle w:val="000000000000" w:firstRow="0" w:lastRow="0" w:firstColumn="0" w:lastColumn="0" w:oddVBand="0" w:evenVBand="0" w:oddHBand="0" w:evenHBand="0" w:firstRowFirstColumn="0" w:firstRowLastColumn="0" w:lastRowFirstColumn="0" w:lastRowLastColumn="0"/>
+              <w:rPr>
+                <w:sz w:val="18"/>
+                <w:szCs w:val="18"/>
+              </w:rPr>
+            </w:pPr>
+            <w:r>
+              <w:rPr>
+                <w:sz w:val="18"/>
+                <w:szCs w:val="18"/>
+              </w:rPr>
+              <w:t>Published</w:t>
+            </w:r>
+          </w:p>
+        </w:tc>
+        <w:tc>
+          <w:tcPr>
+            <w:tcW w:w="5188" w:type="dxa"/>
+          </w:tcPr>
+          <w:p>
+            <w:pPr>
+              <w:pStyle w:val="NoSpacing"/>
+              <w:cnfStyle w:val="000000000000" w:firstRow="0" w:lastRow="0" w:firstColumn="0" w:lastColumn="0" w:oddVBand="0" w:evenVBand="0" w:oddHBand="0" w:evenHBand="0" w:firstRowFirstColumn="0" w:firstRowLastColumn="0" w:lastRowFirstColumn="0" w:lastRowLastColumn="0"/>
+            </w:pPr>
+            <w:r>
+              <w:t>Extended Section 8.1 to document path-based and subdomain-based registry URL patterns as equally compliant implementation approaches, with trade-offs for each. Updated SPEC.md accordingly.</w:t>
             </w:r>
           </w:p>
         </w:tc>
@@ -7129,6 +7208,341 @@
       </w:r>
     </w:p>
     <w:p>
+      <w:pPr>
+        <w:pStyle w:val="Heading3"/>
+      </w:pPr>
+      <w:r>
+        <w:t>Registry URL Patterns</w:t>
+      </w:r>
+    </w:p>
+    <w:p>
+      <w:r>
+        <w:t>The registry= field in the _</w:t>
+      </w:r>
+      <w:proofErr w:type="spellStart"/>
+      <w:r>
+        <w:t>mcp</w:t>
+      </w:r>
+      <w:proofErr w:type="spellEnd"/>
+      <w:r>
+        <w:t xml:space="preserve"> DNS record points to the registry root. The convention does not mandate how MCP servers are addressed relative to that root. Two patterns are in common use, each with distinct trade-offs.</w:t>
+      </w:r>
+    </w:p>
+    <w:p>
+      <w:r>
+        <w:rPr>
+          <w:b/>
+          <w:bCs/>
+        </w:rPr>
+        <w:t>Path-based routing</w:t>
+      </w:r>
+      <w:r>
+        <w:t xml:space="preserve"> serves the registry and all MCP servers from a single domain, differentiating them by URL path:</w:t>
+      </w:r>
+    </w:p>
+    <w:tbl>
+      <w:tblPr>
+        <w:tblStyle w:val="TableGrid"/>
+        <w:tblW w:w="0" w:type="auto"/>
+        <w:shd w:val="clear" w:color="auto" w:fill="E5E8EC" w:themeFill="background2"/>
+        <w:tblCellMar>
+          <w:top w:w="113" w:type="dxa"/>
+          <w:bottom w:w="113" w:type="dxa"/>
+        </w:tblCellMar>
+        <w:tblLook w:val="04A0" w:firstRow="1" w:lastRow="0" w:firstColumn="1" w:lastColumn="0" w:noHBand="0" w:noVBand="1"/>
+      </w:tblPr>
+      <w:tblGrid>
+        <w:gridCol w:w="9011"/>
+      </w:tblGrid>
+      <w:tr>
+        <w:tc>
+          <w:tcPr>
+            <w:tcW w:w="9011" w:type="dxa"/>
+            <w:shd w:val="clear" w:color="auto" w:fill="E5E8EC" w:themeFill="background2"/>
+          </w:tcPr>
+          <w:p>
+            <w:pPr>
+              <w:pStyle w:val="NoSpacing"/>
+              <w:rPr>
+                <w:rFonts w:ascii="IBM Plex Mono" w:hAnsi="IBM Plex Mono"/>
+                <w:sz w:val="18"/>
+                <w:szCs w:val="18"/>
+              </w:rPr>
+            </w:pPr>
+            <w:r>
+              <w:rPr>
+                <w:rFonts w:ascii="IBM Plex Mono" w:hAnsi="IBM Plex Mono"/>
+                <w:sz w:val="18"/>
+                <w:szCs w:val="18"/>
+              </w:rPr>
+              <w:t>registry=https://mcp.example.com/registry</w:t>
+            </w:r>
+          </w:p>
+        </w:tc>
+      </w:tr>
+    </w:tbl>
+    <w:p/>
+    <w:p>
+      <w:r>
+        <w:t>Individual servers are addressed as:</w:t>
+      </w:r>
+    </w:p>
+    <w:tbl>
+      <w:tblPr>
+        <w:tblStyle w:val="TableGrid"/>
+        <w:tblW w:w="0" w:type="auto"/>
+        <w:shd w:val="clear" w:color="auto" w:fill="E5E8EC" w:themeFill="background2"/>
+        <w:tblCellMar>
+          <w:top w:w="113" w:type="dxa"/>
+          <w:bottom w:w="113" w:type="dxa"/>
+        </w:tblCellMar>
+        <w:tblLook w:val="04A0" w:firstRow="1" w:lastRow="0" w:firstColumn="1" w:lastColumn="0" w:noHBand="0" w:noVBand="1"/>
+      </w:tblPr>
+      <w:tblGrid>
+        <w:gridCol w:w="9011"/>
+      </w:tblGrid>
+      <w:tr>
+        <w:tc>
+          <w:tcPr>
+            <w:tcW w:w="9011" w:type="dxa"/>
+            <w:shd w:val="clear" w:color="auto" w:fill="E5E8EC" w:themeFill="background2"/>
+          </w:tcPr>
+          <w:p>
+            <w:pPr>
+              <w:pStyle w:val="NoSpacing"/>
+              <w:rPr>
+                <w:rFonts w:ascii="IBM Plex Mono" w:hAnsi="IBM Plex Mono"/>
+                <w:sz w:val="18"/>
+                <w:szCs w:val="18"/>
+              </w:rPr>
+            </w:pPr>
+            <w:r>
+              <w:rPr>
+                <w:rFonts w:ascii="IBM Plex Mono" w:hAnsi="IBM Plex Mono"/>
+                <w:sz w:val="18"/>
+                <w:szCs w:val="18"/>
+              </w:rPr>
+              <w:t>https://mcp.example.com/articles</w:t>
+            </w:r>
+          </w:p>
+          <w:p>
+            <w:pPr>
+              <w:pStyle w:val="NoSpacing"/>
+              <w:rPr>
+                <w:rFonts w:ascii="IBM Plex Mono" w:hAnsi="IBM Plex Mono"/>
+                <w:sz w:val="18"/>
+                <w:szCs w:val="18"/>
+              </w:rPr>
+            </w:pPr>
+            <w:r>
+              <w:rPr>
+                <w:rFonts w:ascii="IBM Plex Mono" w:hAnsi="IBM Plex Mono"/>
+                <w:sz w:val="18"/>
+                <w:szCs w:val="18"/>
+              </w:rPr>
+              <w:t>https://mcp.example.com/locations</w:t>
+            </w:r>
+          </w:p>
+          <w:p>
+            <w:pPr>
+              <w:pStyle w:val="NoSpacing"/>
+              <w:rPr>
+                <w:rFonts w:ascii="IBM Plex Mono" w:hAnsi="IBM Plex Mono"/>
+                <w:sz w:val="18"/>
+                <w:szCs w:val="18"/>
+              </w:rPr>
+            </w:pPr>
+            <w:r>
+              <w:rPr>
+                <w:rFonts w:ascii="IBM Plex Mono" w:hAnsi="IBM Plex Mono"/>
+                <w:sz w:val="18"/>
+                <w:szCs w:val="18"/>
+              </w:rPr>
+              <w:t>https://mcp.example.com/documents</w:t>
+            </w:r>
+          </w:p>
+        </w:tc>
+      </w:tr>
+    </w:tbl>
+    <w:p/>
+    <w:p>
+      <w:r>
+        <w:t xml:space="preserve">Path-based routing requires a single CloudFront distribution, a single certificate, and simpler DNS configuration. The </w:t>
+      </w:r>
+      <w:proofErr w:type="spellStart"/>
+      <w:r>
+        <w:t>Lambda@Edge</w:t>
+      </w:r>
+      <w:proofErr w:type="spellEnd"/>
+      <w:r>
+        <w:t xml:space="preserve"> function inspects the request path to route each request to the correct handler. The trade-off is that all servers share the same deployment lifecycle — updating one server's logic requires redeploying the shared function. This pattern is well suited to small teams operating all servers centrally.</w:t>
+      </w:r>
+    </w:p>
+    <w:p>
+      <w:r>
+        <w:rPr>
+          <w:b/>
+          <w:bCs/>
+        </w:rPr>
+        <w:t>Subdomain-based routing</w:t>
+      </w:r>
+      <w:r>
+        <w:t xml:space="preserve"> gives each MCP server its own subdomain under the registry domain:</w:t>
+      </w:r>
+    </w:p>
+    <w:tbl>
+      <w:tblPr>
+        <w:tblStyle w:val="TableGrid"/>
+        <w:tblW w:w="0" w:type="auto"/>
+        <w:shd w:val="clear" w:color="auto" w:fill="E5E8EC" w:themeFill="background2"/>
+        <w:tblCellMar>
+          <w:top w:w="113" w:type="dxa"/>
+          <w:bottom w:w="113" w:type="dxa"/>
+        </w:tblCellMar>
+        <w:tblLook w:val="04A0" w:firstRow="1" w:lastRow="0" w:firstColumn="1" w:lastColumn="0" w:noHBand="0" w:noVBand="1"/>
+      </w:tblPr>
+      <w:tblGrid>
+        <w:gridCol w:w="9011"/>
+      </w:tblGrid>
+      <w:tr>
+        <w:tc>
+          <w:tcPr>
+            <w:tcW w:w="9011" w:type="dxa"/>
+            <w:shd w:val="clear" w:color="auto" w:fill="E5E8EC" w:themeFill="background2"/>
+          </w:tcPr>
+          <w:p>
+            <w:pPr>
+              <w:pStyle w:val="NoSpacing"/>
+              <w:rPr>
+                <w:rFonts w:ascii="IBM Plex Mono" w:hAnsi="IBM Plex Mono"/>
+                <w:sz w:val="18"/>
+                <w:szCs w:val="18"/>
+              </w:rPr>
+            </w:pPr>
+            <w:r>
+              <w:rPr>
+                <w:rFonts w:ascii="IBM Plex Mono" w:hAnsi="IBM Plex Mono"/>
+                <w:sz w:val="18"/>
+                <w:szCs w:val="18"/>
+              </w:rPr>
+              <w:t>registry=https://mcp.example.com</w:t>
+            </w:r>
+          </w:p>
+        </w:tc>
+      </w:tr>
+    </w:tbl>
+    <w:p/>
+    <w:p>
+      <w:r>
+        <w:t>Individual servers are addressed as:</w:t>
+      </w:r>
+    </w:p>
+    <w:tbl>
+      <w:tblPr>
+        <w:tblStyle w:val="TableGrid"/>
+        <w:tblW w:w="0" w:type="auto"/>
+        <w:shd w:val="clear" w:color="auto" w:fill="E5E8EC" w:themeFill="background2"/>
+        <w:tblCellMar>
+          <w:top w:w="113" w:type="dxa"/>
+          <w:bottom w:w="113" w:type="dxa"/>
+        </w:tblCellMar>
+        <w:tblLook w:val="04A0" w:firstRow="1" w:lastRow="0" w:firstColumn="1" w:lastColumn="0" w:noHBand="0" w:noVBand="1"/>
+      </w:tblPr>
+      <w:tblGrid>
+        <w:gridCol w:w="9011"/>
+      </w:tblGrid>
+      <w:tr>
+        <w:tc>
+          <w:tcPr>
+            <w:tcW w:w="9011" w:type="dxa"/>
+            <w:shd w:val="clear" w:color="auto" w:fill="E5E8EC" w:themeFill="background2"/>
+          </w:tcPr>
+          <w:p>
+            <w:pPr>
+              <w:pStyle w:val="NoSpacing"/>
+              <w:rPr>
+                <w:rFonts w:ascii="IBM Plex Mono" w:hAnsi="IBM Plex Mono"/>
+                <w:sz w:val="18"/>
+                <w:szCs w:val="18"/>
+              </w:rPr>
+            </w:pPr>
+            <w:r>
+              <w:rPr>
+                <w:rFonts w:ascii="IBM Plex Mono" w:hAnsi="IBM Plex Mono"/>
+                <w:sz w:val="18"/>
+                <w:szCs w:val="18"/>
+              </w:rPr>
+              <w:t>https://articles.mcp.example.com</w:t>
+            </w:r>
+          </w:p>
+          <w:p>
+            <w:pPr>
+              <w:pStyle w:val="NoSpacing"/>
+              <w:rPr>
+                <w:rFonts w:ascii="IBM Plex Mono" w:hAnsi="IBM Plex Mono"/>
+                <w:sz w:val="18"/>
+                <w:szCs w:val="18"/>
+              </w:rPr>
+            </w:pPr>
+            <w:r>
+              <w:rPr>
+                <w:rFonts w:ascii="IBM Plex Mono" w:hAnsi="IBM Plex Mono"/>
+                <w:sz w:val="18"/>
+                <w:szCs w:val="18"/>
+              </w:rPr>
+              <w:t>https://locations.mcp.example.com</w:t>
+            </w:r>
+          </w:p>
+          <w:p>
+            <w:pPr>
+              <w:pStyle w:val="NoSpacing"/>
+              <w:rPr>
+                <w:rFonts w:ascii="IBM Plex Mono" w:hAnsi="IBM Plex Mono"/>
+                <w:sz w:val="18"/>
+                <w:szCs w:val="18"/>
+              </w:rPr>
+            </w:pPr>
+            <w:r>
+              <w:rPr>
+                <w:rFonts w:ascii="IBM Plex Mono" w:hAnsi="IBM Plex Mono"/>
+                <w:sz w:val="18"/>
+                <w:szCs w:val="18"/>
+              </w:rPr>
+              <w:t>https://documents.mcp.example.com</w:t>
+            </w:r>
+          </w:p>
+        </w:tc>
+      </w:tr>
+    </w:tbl>
+    <w:p/>
+    <w:p>
+      <w:r>
+        <w:lastRenderedPageBreak/>
+        <w:t xml:space="preserve">Subdomain-based routing requires a wildcard certificate for *.mcp.example.com — note that a single-level wildcard such as *.example.com does not cover two levels deep — and either a separate CloudFront distribution per server or a single wildcard distribution with subdomain-aware routing in the </w:t>
+      </w:r>
+      <w:proofErr w:type="spellStart"/>
+      <w:r>
+        <w:t>Lambda@Edge</w:t>
+      </w:r>
+      <w:proofErr w:type="spellEnd"/>
+      <w:r>
+        <w:t xml:space="preserve"> function. The trade-off is additional infrastructure complexity. The benefit is genuine independence: each server can be deployed, updated, and owned by a different team without touching shared infrastructure. This pattern is better suited to larger organisations where different teams own different MCP servers.</w:t>
+      </w:r>
+    </w:p>
+    <w:p>
+      <w:r>
+        <w:t>Both patterns are fully compliant with the _</w:t>
+      </w:r>
+      <w:proofErr w:type="spellStart"/>
+      <w:r>
+        <w:t>mcp</w:t>
+      </w:r>
+      <w:proofErr w:type="spellEnd"/>
+      <w:r>
+        <w:t xml:space="preserve"> DNS convention. The reference implementation at mcp.mariothomas.com uses subdomain-based routing. Implementers should choose based on their organisational structure, team ownership model, and operational preferences rather than any constraint imposed by this convention.</w:t>
+      </w:r>
+    </w:p>
+    <w:p>
       <w:r>
         <w:t>The following subsections describe the reference implementation of this pattern using Amazon Web Services. Equivalent implementations are possible using Cloudflare Workers + KV (Cloudflare Workers can read request bodies and support JWT validation natively), Azure Front Door + Azure Cosmos DB, or any CDN provider that supports edge computing with request body access and an associated data store. The AWS implementation is provided as a complete, tested reference — not as a requirement.</w:t>
       </w:r>
@@ -7694,6 +8108,7 @@
                 <w:sz w:val="18"/>
                 <w:szCs w:val="18"/>
               </w:rPr>
+              <w:lastRenderedPageBreak/>
               <w:t xml:space="preserve"># Note the table ARN — you will need it for the </w:t>
             </w:r>
             <w:proofErr w:type="spellStart"/>
@@ -7723,6 +8138,7 @@
         <w:pStyle w:val="Heading2"/>
       </w:pPr>
       <w:r>
+        <w:lastRenderedPageBreak/>
         <w:t xml:space="preserve">8.4  Step 2 — Write the </w:t>
       </w:r>
       <w:proofErr w:type="spellStart"/>
@@ -7790,7 +8206,6 @@
                 <w:sz w:val="18"/>
                 <w:szCs w:val="18"/>
               </w:rPr>
-              <w:lastRenderedPageBreak/>
               <w:t>const</w:t>
             </w:r>
             <w:proofErr w:type="spellEnd"/>
@@ -9435,6 +9850,7 @@
                 <w:sz w:val="18"/>
                 <w:szCs w:val="18"/>
               </w:rPr>
+              <w:lastRenderedPageBreak/>
               <w:t>const</w:t>
             </w:r>
             <w:proofErr w:type="spellEnd"/>
@@ -11110,7 +11526,11 @@
             </w:r>
             <w:proofErr w:type="spellEnd"/>
             <w:r>
-              <w:t xml:space="preserve"> performs a full table scan and is appropriate for small registries (under a few hundred servers). For larger deployments, a partition-key design with a GSI on the public attribute is recommended to avoid scan costs and improve query efficiency. The reference implementation in the GitHub repository demonstrates both patterns.</w:t>
+              <w:t xml:space="preserve"> performs a full table scan and is appropriate for small registries (under a few hundred servers). For larger deployments, a partition-key design with a GSI on the public attribute is recommended to avoid scan costs and </w:t>
+            </w:r>
+            <w:r>
+              <w:lastRenderedPageBreak/>
+              <w:t>improve query efficiency. The reference implementation in the GitHub repository demonstrates both patterns.</w:t>
             </w:r>
           </w:p>
         </w:tc>
@@ -11121,6 +11541,7 @@
         <w:pStyle w:val="Heading2"/>
       </w:pPr>
       <w:r>
+        <w:lastRenderedPageBreak/>
         <w:t xml:space="preserve">8.5  Step 3 — Deploy the </w:t>
       </w:r>
       <w:proofErr w:type="spellStart"/>
@@ -11301,7 +11722,6 @@
                 <w:sz w:val="18"/>
                 <w:szCs w:val="18"/>
               </w:rPr>
-              <w:lastRenderedPageBreak/>
               <w:t>aws</w:t>
             </w:r>
             <w:proofErr w:type="spellEnd"/>
@@ -11717,7 +12137,6 @@
         <w:pStyle w:val="Heading2"/>
       </w:pPr>
       <w:r>
-        <w:lastRenderedPageBreak/>
         <w:t>8.6  Step 4 — Create the CloudFront Distribution</w:t>
       </w:r>
     </w:p>
@@ -12053,6 +12472,7 @@
                 <w:sz w:val="18"/>
                 <w:szCs w:val="18"/>
               </w:rPr>
+              <w:lastRenderedPageBreak/>
               <w:t>--item '{</w:t>
             </w:r>
           </w:p>
@@ -12318,7 +12738,6 @@
         <w:pStyle w:val="Heading1"/>
       </w:pPr>
       <w:r>
-        <w:lastRenderedPageBreak/>
         <w:t>9.  Cost Analysis</w:t>
       </w:r>
     </w:p>

</xml_diff>

<commit_message>
Add Lambda function, v1.4 paper, version archive, health check, and .gitignore
Add Lambda function, v1.4 paper, version archive, health check, and .gitignore

- mcp-function/: index.js, package.json, package-lock.json
- paper/: v1.4 updates (md, docx, pdf)
- paper/versions/: v1.3 archive (md, docx, pdf)
- servers/health.json
- .gitignore: excludes node_modules, venv, .DS_Store, *.zip, .env
</commit_message>
<xml_diff>
--- a/paper/mcp-registry-architecture.docx
+++ b/paper/mcp-registry-architecture.docx
@@ -208,7 +208,7 @@
           <w:rFonts w:ascii="Source Serif 4 ExtraLight" w:hAnsi="Source Serif 4 ExtraLight"/>
           <w:szCs w:val="22"/>
         </w:rPr>
-        <w:t>3</w:t>
+        <w:t>4</w:t>
       </w:r>
     </w:p>
     <w:p>
@@ -859,6 +859,103 @@
             </w:pPr>
             <w:r>
               <w:t>Extended Section 8.1 to document path-based and subdomain-based registry URL patterns as equally compliant implementation approaches, with trade-offs for each. Updated SPEC.md accordingly.</w:t>
+            </w:r>
+          </w:p>
+        </w:tc>
+      </w:tr>
+      <w:tr>
+        <w:trPr>
+          <w:cnfStyle w:val="000000100000" w:firstRow="0" w:lastRow="0" w:firstColumn="0" w:lastColumn="0" w:oddVBand="0" w:evenVBand="0" w:oddHBand="1" w:evenHBand="0" w:firstRowFirstColumn="0" w:firstRowLastColumn="0" w:lastRowFirstColumn="0" w:lastRowLastColumn="0"/>
+        </w:trPr>
+        <w:tc>
+          <w:tcPr>
+            <w:cnfStyle w:val="001000000000" w:firstRow="0" w:lastRow="0" w:firstColumn="1" w:lastColumn="0" w:oddVBand="0" w:evenVBand="0" w:oddHBand="0" w:evenHBand="0" w:firstRowFirstColumn="0" w:firstRowLastColumn="0" w:lastRowFirstColumn="0" w:lastRowLastColumn="0"/>
+            <w:tcW w:w="882" w:type="dxa"/>
+          </w:tcPr>
+          <w:p>
+            <w:pPr>
+              <w:pStyle w:val="NoSpacing"/>
+              <w:rPr>
+                <w:b w:val="0"/>
+                <w:bCs w:val="0"/>
+                <w:sz w:val="18"/>
+                <w:szCs w:val="18"/>
+              </w:rPr>
+            </w:pPr>
+            <w:r>
+              <w:rPr>
+                <w:b w:val="0"/>
+                <w:bCs w:val="0"/>
+                <w:sz w:val="18"/>
+                <w:szCs w:val="18"/>
+              </w:rPr>
+              <w:t>1.4</w:t>
+            </w:r>
+          </w:p>
+        </w:tc>
+        <w:tc>
+          <w:tcPr>
+            <w:tcW w:w="1807" w:type="dxa"/>
+          </w:tcPr>
+          <w:p>
+            <w:pPr>
+              <w:pStyle w:val="NoSpacing"/>
+              <w:cnfStyle w:val="000000100000" w:firstRow="0" w:lastRow="0" w:firstColumn="0" w:lastColumn="0" w:oddVBand="0" w:evenVBand="0" w:oddHBand="1" w:evenHBand="0" w:firstRowFirstColumn="0" w:firstRowLastColumn="0" w:lastRowFirstColumn="0" w:lastRowLastColumn="0"/>
+              <w:rPr>
+                <w:sz w:val="18"/>
+                <w:szCs w:val="18"/>
+              </w:rPr>
+            </w:pPr>
+            <w:r>
+              <w:rPr>
+                <w:sz w:val="18"/>
+                <w:szCs w:val="18"/>
+              </w:rPr>
+              <w:t>2 March 2026</w:t>
+            </w:r>
+          </w:p>
+        </w:tc>
+        <w:tc>
+          <w:tcPr>
+            <w:tcW w:w="1134" w:type="dxa"/>
+          </w:tcPr>
+          <w:p>
+            <w:pPr>
+              <w:pStyle w:val="NoSpacing"/>
+              <w:cnfStyle w:val="000000100000" w:firstRow="0" w:lastRow="0" w:firstColumn="0" w:lastColumn="0" w:oddVBand="0" w:evenVBand="0" w:oddHBand="1" w:evenHBand="0" w:firstRowFirstColumn="0" w:firstRowLastColumn="0" w:lastRowFirstColumn="0" w:lastRowLastColumn="0"/>
+              <w:rPr>
+                <w:sz w:val="18"/>
+                <w:szCs w:val="18"/>
+              </w:rPr>
+            </w:pPr>
+            <w:r>
+              <w:rPr>
+                <w:sz w:val="18"/>
+                <w:szCs w:val="18"/>
+              </w:rPr>
+              <w:t>Published</w:t>
+            </w:r>
+          </w:p>
+        </w:tc>
+        <w:tc>
+          <w:tcPr>
+            <w:tcW w:w="5188" w:type="dxa"/>
+          </w:tcPr>
+          <w:p>
+            <w:pPr>
+              <w:pStyle w:val="NoSpacing"/>
+              <w:cnfStyle w:val="000000100000" w:firstRow="0" w:lastRow="0" w:firstColumn="0" w:lastColumn="0" w:oddVBand="0" w:evenVBand="0" w:oddHBand="1" w:evenHBand="0" w:firstRowFirstColumn="0" w:firstRowLastColumn="0" w:lastRowFirstColumn="0" w:lastRowLastColumn="0"/>
+            </w:pPr>
+            <w:r>
+              <w:t xml:space="preserve">Updated Section 8.1 to reflect that the reference implementation at mcp.mariothomas.com uses path-based routing. Updated Section 8.4 and 8.5 to use correct filename index.js and handler </w:t>
+            </w:r>
+            <w:proofErr w:type="spellStart"/>
+            <w:r>
+              <w:t>index.handler</w:t>
+            </w:r>
+            <w:proofErr w:type="spellEnd"/>
+            <w:r>
+              <w:t>. Rewrote Section 12 in present tense to reflect live deployment, confirmed GitHub repository URL, and noted path-based routing pattern used in the reference implementation.</w:t>
             </w:r>
           </w:p>
         </w:tc>
@@ -7539,7 +7636,13 @@
       </w:r>
       <w:proofErr w:type="spellEnd"/>
       <w:r>
-        <w:t xml:space="preserve"> DNS convention. The reference implementation at mcp.mariothomas.com uses subdomain-based routing. Implementers should choose based on their organisational structure, team ownership model, and operational preferences rather than any constraint imposed by this convention.</w:t>
+        <w:t xml:space="preserve"> DNS convention. </w:t>
+      </w:r>
+      <w:r>
+        <w:t>The reference implementation at mcp.mariothomas.com uses path-based routing.</w:t>
+      </w:r>
+      <w:r>
+        <w:t xml:space="preserve"> Implementers should choose based on their organisational structure, team ownership model, and operational preferences rather than any constraint imposed by this convention.</w:t>
       </w:r>
     </w:p>
     <w:p>
@@ -8108,7 +8211,6 @@
                 <w:sz w:val="18"/>
                 <w:szCs w:val="18"/>
               </w:rPr>
-              <w:lastRenderedPageBreak/>
               <w:t xml:space="preserve"># Note the table ARN — you will need it for the </w:t>
             </w:r>
             <w:proofErr w:type="spellStart"/>
@@ -8152,7 +8254,13 @@
     </w:p>
     <w:p>
       <w:r>
-        <w:t xml:space="preserve">Create a file named registry-function.js. </w:t>
+        <w:t xml:space="preserve">Create a file named </w:t>
+      </w:r>
+      <w:r>
+        <w:t>index</w:t>
+      </w:r>
+      <w:r>
+        <w:t xml:space="preserve">.js. </w:t>
       </w:r>
       <w:proofErr w:type="spellStart"/>
       <w:r>
@@ -9850,7 +9958,6 @@
                 <w:sz w:val="18"/>
                 <w:szCs w:val="18"/>
               </w:rPr>
-              <w:lastRenderedPageBreak/>
               <w:t>const</w:t>
             </w:r>
             <w:proofErr w:type="spellEnd"/>
@@ -9998,6 +10105,7 @@
                 <w:sz w:val="18"/>
                 <w:szCs w:val="18"/>
               </w:rPr>
+              <w:lastRenderedPageBreak/>
               <w:t>if (tool === '</w:t>
             </w:r>
             <w:proofErr w:type="spellStart"/>
@@ -11526,11 +11634,7 @@
             </w:r>
             <w:proofErr w:type="spellEnd"/>
             <w:r>
-              <w:t xml:space="preserve"> performs a full table scan and is appropriate for small registries (under a few hundred servers). For larger deployments, a partition-key design with a GSI on the public attribute is recommended to avoid scan costs and </w:t>
-            </w:r>
-            <w:r>
-              <w:lastRenderedPageBreak/>
-              <w:t>improve query efficiency. The reference implementation in the GitHub repository demonstrates both patterns.</w:t>
+              <w:t xml:space="preserve"> performs a full table scan and is appropriate for small registries (under a few hundred servers). For larger deployments, a partition-key design with a GSI on the public attribute is recommended to avoid scan costs and improve query efficiency. The reference implementation in the GitHub repository demonstrates both patterns.</w:t>
             </w:r>
           </w:p>
         </w:tc>
@@ -11639,7 +11743,23 @@
                 <w:sz w:val="18"/>
                 <w:szCs w:val="18"/>
               </w:rPr>
-              <w:t xml:space="preserve">zip -r registry-function.zip registry-function.js </w:t>
+              <w:t xml:space="preserve">zip -r registry-function.zip </w:t>
+            </w:r>
+            <w:r>
+              <w:rPr>
+                <w:rFonts w:ascii="IBM Plex Mono" w:hAnsi="IBM Plex Mono"/>
+                <w:sz w:val="18"/>
+                <w:szCs w:val="18"/>
+              </w:rPr>
+              <w:t>index</w:t>
+            </w:r>
+            <w:r>
+              <w:rPr>
+                <w:rFonts w:ascii="IBM Plex Mono" w:hAnsi="IBM Plex Mono"/>
+                <w:sz w:val="18"/>
+                <w:szCs w:val="18"/>
+              </w:rPr>
+              <w:t xml:space="preserve">.js </w:t>
             </w:r>
             <w:proofErr w:type="spellStart"/>
             <w:r>
@@ -11885,7 +12005,15 @@
                 <w:sz w:val="18"/>
                 <w:szCs w:val="18"/>
               </w:rPr>
-              <w:t>--handler registry-</w:t>
+              <w:t xml:space="preserve">--handler </w:t>
+            </w:r>
+            <w:r>
+              <w:rPr>
+                <w:rFonts w:ascii="IBM Plex Mono" w:hAnsi="IBM Plex Mono"/>
+                <w:sz w:val="18"/>
+                <w:szCs w:val="18"/>
+              </w:rPr>
+              <w:t>index.han</w:t>
             </w:r>
             <w:proofErr w:type="spellStart"/>
             <w:r>
@@ -11894,7 +12022,33 @@
                 <w:sz w:val="18"/>
                 <w:szCs w:val="18"/>
               </w:rPr>
-              <w:t>function.handler</w:t>
+              <w:t>dler</w:t>
+            </w:r>
+            <w:r>
+              <w:rPr>
+                <w:rFonts w:ascii="IBM Plex Mono" w:hAnsi="IBM Plex Mono"/>
+                <w:sz w:val="18"/>
+                <w:szCs w:val="18"/>
+              </w:rPr>
+              <w:t xml:space="preserve"> \</w:t>
+            </w:r>
+          </w:p>
+          <w:p>
+            <w:pPr>
+              <w:pStyle w:val="NoSpacing"/>
+              <w:rPr>
+                <w:rFonts w:ascii="IBM Plex Mono" w:hAnsi="IBM Plex Mono"/>
+                <w:sz w:val="18"/>
+                <w:szCs w:val="18"/>
+              </w:rPr>
+            </w:pPr>
+            <w:r>
+              <w:rPr>
+                <w:rFonts w:ascii="IBM Plex Mono" w:hAnsi="IBM Plex Mono"/>
+                <w:sz w:val="18"/>
+                <w:szCs w:val="18"/>
+              </w:rPr>
+              <w:t>--zip-fil</w:t>
             </w:r>
             <w:proofErr w:type="spellEnd"/>
             <w:r>
@@ -11903,25 +12057,7 @@
                 <w:sz w:val="18"/>
                 <w:szCs w:val="18"/>
               </w:rPr>
-              <w:t xml:space="preserve"> \</w:t>
-            </w:r>
-          </w:p>
-          <w:p>
-            <w:pPr>
-              <w:pStyle w:val="NoSpacing"/>
-              <w:rPr>
-                <w:rFonts w:ascii="IBM Plex Mono" w:hAnsi="IBM Plex Mono"/>
-                <w:sz w:val="18"/>
-                <w:szCs w:val="18"/>
-              </w:rPr>
-            </w:pPr>
-            <w:r>
-              <w:rPr>
-                <w:rFonts w:ascii="IBM Plex Mono" w:hAnsi="IBM Plex Mono"/>
-                <w:sz w:val="18"/>
-                <w:szCs w:val="18"/>
-              </w:rPr>
-              <w:t>--zip-file fileb://registry-function.zip \</w:t>
+              <w:t>e fileb://registry-function.zip \</w:t>
             </w:r>
           </w:p>
           <w:p>
@@ -12472,7 +12608,6 @@
                 <w:sz w:val="18"/>
                 <w:szCs w:val="18"/>
               </w:rPr>
-              <w:lastRenderedPageBreak/>
               <w:t>--item '{</w:t>
             </w:r>
           </w:p>
@@ -12609,6 +12744,7 @@
                 <w:sz w:val="18"/>
                 <w:szCs w:val="18"/>
               </w:rPr>
+              <w:lastRenderedPageBreak/>
               <w:t>"public":         { "BOOL": false },</w:t>
             </w:r>
           </w:p>
@@ -13539,7 +13675,7 @@
     </w:p>
     <w:p>
       <w:r>
-        <w:t>This paper is accompanied by a reference implementation that will be published concurrently with this version at mcp.mariothomas.com. When live, it will be a fully functional MCP registry and three MCP servers — public articles, public locations, and private documents with signed-URL retrieval — deployed on the architecture described in this paper and discoverable via a live _</w:t>
+        <w:t>This paper is accompanied by a live reference implementation at mcp.mariothomas.com — a fully functional MCP registry and three MCP servers deployed on the architecture described in this paper and discoverable via a live _</w:t>
       </w:r>
       <w:proofErr w:type="spellStart"/>
       <w:r>
@@ -13552,7 +13688,15 @@
     </w:p>
     <w:p>
       <w:r>
-        <w:t>A companion GitHub repository with full source will be linked from mariothomas.com at publication. The implementation serves three purposes: to validate that the architecture works as specified; to provide a concrete reference that implementers can inspect and learn from; and to demonstrate the public/private access model with real examples rather than hypothetical ones.</w:t>
+        <w:t xml:space="preserve">The reference implementation uses path-based routing. All servers are served from a single CloudFront distribution with a single </w:t>
+      </w:r>
+      <w:proofErr w:type="spellStart"/>
+      <w:r>
+        <w:t>Lambda@Edge</w:t>
+      </w:r>
+      <w:proofErr w:type="spellEnd"/>
+      <w:r>
+        <w:t xml:space="preserve"> function routing on URL path.</w:t>
       </w:r>
     </w:p>
     <w:tbl>
@@ -13600,52 +13744,111 @@
               <w:pStyle w:val="NoSpacing"/>
             </w:pPr>
             <w:r>
-              <w:t>DNS record:          _mcp.mariothomas.com</w:t>
-            </w:r>
-          </w:p>
-          <w:p>
-            <w:pPr>
-              <w:pStyle w:val="NoSpacing"/>
-            </w:pPr>
-            <w:r>
-              <w:t>Registry:                https://mcp.mariothomas.com/registry</w:t>
-            </w:r>
-          </w:p>
-          <w:p>
-            <w:pPr>
-              <w:pStyle w:val="NoSpacing"/>
-            </w:pPr>
-            <w:r>
-              <w:t>Articles MCP:        https://mcp.mariothomas.com/articles    (public)</w:t>
-            </w:r>
-          </w:p>
-          <w:p>
-            <w:pPr>
-              <w:pStyle w:val="NoSpacing"/>
-            </w:pPr>
-            <w:r>
-              <w:t>Locations MCP:    https://mcp.mariothomas.com/locations   (public)</w:t>
-            </w:r>
-          </w:p>
-          <w:p>
-            <w:pPr>
-              <w:pStyle w:val="NoSpacing"/>
-            </w:pPr>
-            <w:r>
-              <w:t>Documents MCP: https://mcp.mariothomas.com/documents   (private — auth required)</w:t>
-            </w:r>
-          </w:p>
-          <w:p>
-            <w:pPr>
-              <w:pStyle w:val="NoSpacing"/>
-            </w:pPr>
-            <w:r>
-              <w:t>Source code:        https://github.com/mariothomas/mcp-dns-registry (link at publication)</w:t>
+              <w:t xml:space="preserve">DNS record:     </w:t>
+            </w:r>
+            <w:r>
+              <w:t xml:space="preserve">   </w:t>
+            </w:r>
+            <w:r>
+              <w:t>_mcp.mariothomas.com</w:t>
+            </w:r>
+          </w:p>
+          <w:p>
+            <w:pPr>
+              <w:pStyle w:val="NoSpacing"/>
+            </w:pPr>
+            <w:r>
+              <w:t xml:space="preserve">Registry:       </w:t>
+            </w:r>
+            <w:r>
+              <w:t xml:space="preserve">       </w:t>
+            </w:r>
+            <w:r>
+              <w:t>https://mcp.mariothomas.com/registry       (public)</w:t>
+            </w:r>
+          </w:p>
+          <w:p>
+            <w:pPr>
+              <w:pStyle w:val="NoSpacing"/>
+            </w:pPr>
+            <w:r>
+              <w:t xml:space="preserve">Articles MCP:   </w:t>
+            </w:r>
+            <w:r>
+              <w:t xml:space="preserve">   </w:t>
+            </w:r>
+            <w:r>
+              <w:t>https://mcp.mariothomas.com/articles       (public)</w:t>
+            </w:r>
+          </w:p>
+          <w:p>
+            <w:pPr>
+              <w:pStyle w:val="NoSpacing"/>
+            </w:pPr>
+            <w:r>
+              <w:t>Locations MCP:  https://mcp.mariothomas.com/locations      (public)</w:t>
+            </w:r>
+          </w:p>
+          <w:p>
+            <w:pPr>
+              <w:pStyle w:val="NoSpacing"/>
+            </w:pPr>
+            <w:r>
+              <w:t xml:space="preserve">Documents MCP:  https://mcp.mariothomas.com/documents </w:t>
+            </w:r>
+            <w:r>
+              <w:t xml:space="preserve"> </w:t>
+            </w:r>
+            <w:r>
+              <w:t>(private — bearer token required)</w:t>
             </w:r>
           </w:p>
         </w:tc>
       </w:tr>
     </w:tbl>
+    <w:p/>
+    <w:p>
+      <w:r>
+        <w:t xml:space="preserve">The articles server exposes a </w:t>
+      </w:r>
+      <w:proofErr w:type="spellStart"/>
+      <w:r>
+        <w:t>queryable</w:t>
+      </w:r>
+      <w:proofErr w:type="spellEnd"/>
+      <w:r>
+        <w:t xml:space="preserve"> catalogue of published articles from mariothomas.com, filterable by tag and date range. The locations server exposes a log of cities visited with arrival and departure dates. The documents server exposes private advisory materials and is accessible only with a valid RS256 JWT bearer token, demonstrating the public/private access model described in Section 6.</w:t>
+      </w:r>
+    </w:p>
+    <w:p>
+      <w:r>
+        <w:t>Full source code is available at github.com/</w:t>
+      </w:r>
+      <w:proofErr w:type="spellStart"/>
+      <w:r>
+        <w:t>mariothomas</w:t>
+      </w:r>
+      <w:proofErr w:type="spellEnd"/>
+      <w:r>
+        <w:t>/</w:t>
+      </w:r>
+      <w:proofErr w:type="spellStart"/>
+      <w:r>
+        <w:t>mcp</w:t>
+      </w:r>
+      <w:proofErr w:type="spellEnd"/>
+      <w:r>
+        <w:t>-</w:t>
+      </w:r>
+      <w:proofErr w:type="spellStart"/>
+      <w:r>
+        <w:t>dns</w:t>
+      </w:r>
+      <w:proofErr w:type="spellEnd"/>
+      <w:r>
+        <w:t>-registry. The implementation serves three purposes: to validate that the architecture works as specified; to provide a concrete reference that implementers can inspect and learn from; and to demonstrate the public/private access model with real data rather than hypothetical examples.</w:t>
+      </w:r>
+    </w:p>
     <w:p>
       <w:pPr>
         <w:pStyle w:val="Heading2"/>
@@ -13809,6 +14012,7 @@
     <w:p/>
     <w:p>
       <w:r>
+        <w:lastRenderedPageBreak/>
         <w:t>Any agent that knows the domain mariothomas.com can discover the full MCP ecosystem from this single record. The TTL of 300 seconds balances agility — allowing rapid updates during the early life of the implementation — with resilience against the record being unavailable.</w:t>
       </w:r>
     </w:p>
@@ -13817,7 +14021,6 @@
         <w:pStyle w:val="Heading2"/>
       </w:pPr>
       <w:r>
-        <w:lastRenderedPageBreak/>
         <w:t>12.2  Registry DynamoDB Structure</w:t>
       </w:r>
     </w:p>
@@ -14365,6 +14568,7 @@
                 <w:sz w:val="18"/>
                 <w:szCs w:val="18"/>
               </w:rPr>
+              <w:lastRenderedPageBreak/>
               <w:t>"tags": ["agentic-ai", "board-governance", "ai-strategy"],</w:t>
             </w:r>
           </w:p>
@@ -14830,7 +15034,11 @@
     </w:p>
     <w:p>
       <w:r>
-        <w:t>The documents MCP server is the most architecturally significant of the three. It demonstrates that the same serverless pattern used for public data can serve private documents with full access controls. The documents served are illustrative examples clearly labelled as fictional — their purpose is to demonstrate the retrieval architecture, not to expose real sensitive information.</w:t>
+        <w:t xml:space="preserve">The documents MCP server is the most architecturally significant of the three. It demonstrates that the same serverless pattern used for public data can serve private documents with full access controls. The documents served are illustrative examples </w:t>
+      </w:r>
+      <w:r>
+        <w:lastRenderedPageBreak/>
+        <w:t>clearly labelled as fictional — their purpose is to demonstrate the retrieval architecture, not to expose real sensitive information.</w:t>
       </w:r>
     </w:p>
     <w:tbl>
@@ -14945,7 +15153,6 @@
                 <w:b w:val="0"/>
                 <w:bCs w:val="0"/>
               </w:rPr>
-              <w:lastRenderedPageBreak/>
               <w:t>get_document_metadata</w:t>
             </w:r>
             <w:proofErr w:type="spellEnd"/>
@@ -15309,6 +15516,7 @@
         </w:numPr>
       </w:pPr>
       <w:r>
+        <w:lastRenderedPageBreak/>
         <w:t>Agent calls tools/list on the registry with bearer token. Function validates JWT, queries DynamoDB for all three server items, returns full manifest including private documents server.</w:t>
       </w:r>
     </w:p>
@@ -15353,7 +15561,6 @@
         </w:numPr>
       </w:pPr>
       <w:r>
-        <w:lastRenderedPageBreak/>
         <w:t xml:space="preserve">Agent calls </w:t>
       </w:r>
       <w:proofErr w:type="spellStart"/>

</xml_diff>